<commit_message>
Portail formateur — ajout de la journée 3
Co-Authored-By: Claude Opus 5.5 <noreply@anthropic.com>
Claude-Session: https://claude.ai/code/session_01F4nqF4fVcBrV9H1uwuQCoL
</commit_message>
<xml_diff>
--- a/PPR_Formateur/documents_a_remettre/PPR_J3_Book_stagiaire.docx
+++ b/PPR_Formateur/documents_a_remettre/PPR_J3_Book_stagiaire.docx
@@ -1114,7 +1114,7 @@
                 <w:sz w:val="18"/>
                 <w:szCs w:val="18"/>
               </w:rPr>
-              <w:t xml:space="preserve">Repérer une carrière longue</w:t>
+              <w:t xml:space="preserve">La carrière longue : repérer et vérifier</w:t>
             </w:r>
           </w:p>
         </w:tc>
@@ -1146,7 +1146,7 @@
                 <w:sz w:val="18"/>
                 <w:szCs w:val="18"/>
               </w:rPr>
-              <w:t xml:space="preserve">25 min</w:t>
+              <w:t xml:space="preserve">40 min</w:t>
             </w:r>
           </w:p>
         </w:tc>
@@ -1178,7 +1178,7 @@
                 <w:sz w:val="18"/>
                 <w:szCs w:val="18"/>
               </w:rPr>
-              <w:t xml:space="preserve">Binômes</w:t>
+              <w:t xml:space="preserve">Apport + binômes</w:t>
             </w:r>
           </w:p>
         </w:tc>
@@ -1312,7 +1312,7 @@
                 <w:sz w:val="18"/>
                 <w:szCs w:val="18"/>
               </w:rPr>
-              <w:t xml:space="preserve">1 h 40</w:t>
+              <w:t xml:space="preserve">1 h 25</w:t>
             </w:r>
           </w:p>
         </w:tc>
@@ -4205,7 +4205,7 @@
           <w:sz w:val="32"/>
           <w:szCs w:val="32"/>
         </w:rPr>
-        <w:t xml:space="preserve">Séquence 3 — Repérer une carrière longue</w:t>
+        <w:t xml:space="preserve">Séquence 3 — La carrière longue : repérer et vérifier</w:t>
       </w:r>
     </w:p>
     <w:p>
@@ -4222,7 +4222,7 @@
           <w:sz w:val="20"/>
           <w:szCs w:val="20"/>
         </w:rPr>
-        <w:t xml:space="preserve">Durée : 25 min</w:t>
+        <w:t xml:space="preserve">Durée : 40 min</w:t>
       </w:r>
       <w:r>
         <w:rPr>
@@ -4231,7 +4231,7 @@
           <w:sz w:val="20"/>
           <w:szCs w:val="20"/>
         </w:rPr>
-        <w:t xml:space="preserve"> · Apport (10 min), repérage en binôme sur les 4 assurés (10 min), correction (5 min)</w:t>
+        <w:t xml:space="preserve"> · Apport (15 min), étude en binôme des 4 assurés (15 min), correction (10 min)</w:t>
       </w:r>
     </w:p>
     <w:p>
@@ -4246,7 +4246,7 @@
           <w:sz w:val="20"/>
           <w:szCs w:val="20"/>
         </w:rPr>
-        <w:t xml:space="preserve">Un assuré qui a commencé à travailler jeune peut partir avant l'âge légal. Le premier filtre est simple : avoir validé </w:t>
+        <w:t xml:space="preserve">Un assuré qui a commencé à travailler jeune peut partir avant l'âge légal, </w:t>
       </w:r>
       <w:r>
         <w:rPr>
@@ -4257,7 +4257,7 @@
           <w:sz w:val="20"/>
           <w:szCs w:val="20"/>
         </w:rPr>
-        <w:t xml:space="preserve">au moins 5 trimestres avant la fin de l'année civile de ses 16, 18, 20 ou 21 ans</w:t>
+        <w:t xml:space="preserve">sans décote</w:t>
       </w:r>
       <w:r>
         <w:rPr>
@@ -4266,8 +4266,2992 @@
           <w:sz w:val="20"/>
           <w:szCs w:val="20"/>
         </w:rPr>
-        <w:t xml:space="preserve"> (4 trimestres suffisent pour une personne née d'octobre à décembre).</w:t>
+        <w:t xml:space="preserve">, s'il remplit deux conditions : un début de carrière précoce, puis une durée cotisée suffisante.</w:t>
       </w:r>
+    </w:p>
+    <w:p>
+      <w:pPr>
+        <w:pStyle w:val="Heading2"/>
+        <w:keepNext/>
+        <w:spacing w:after="100" w:before="240"/>
+      </w:pPr>
+      <w:r>
+        <w:rPr>
+          <w:rFonts w:ascii="Fraunces" w:cs="Fraunces" w:eastAsia="Fraunces" w:hAnsi="Fraunces"/>
+          <w:b/>
+          <w:bCs/>
+          <w:color w:val="0D2B56"/>
+          <w:sz w:val="25"/>
+          <w:szCs w:val="25"/>
+        </w:rPr>
+        <w:t xml:space="preserve">Condition 1 — le début de carrière</w:t>
+      </w:r>
+    </w:p>
+    <w:tbl>
+      <w:tblPr>
+        <w:tblW w:type="dxa" w:w="9638"/>
+        <w:tblBorders>
+          <w:top w:val="single" w:color="auto" w:sz="4"/>
+          <w:left w:val="single" w:color="auto" w:sz="4"/>
+          <w:bottom w:val="single" w:color="auto" w:sz="4"/>
+          <w:right w:val="single" w:color="auto" w:sz="4"/>
+          <w:insideH w:val="single" w:color="auto" w:sz="4"/>
+          <w:insideV w:val="single" w:color="auto" w:sz="4"/>
+        </w:tblBorders>
+      </w:tblPr>
+      <w:tblGrid>
+        <w:gridCol w:w="3000"/>
+        <w:gridCol w:w="3300"/>
+        <w:gridCol w:w="3338"/>
+      </w:tblGrid>
+      <w:tr>
+        <w:trPr>
+          <w:cantSplit/>
+          <w:tblHeader/>
+        </w:trPr>
+        <w:tc>
+          <w:tcPr>
+            <w:tcW w:type="dxa" w:w="3000"/>
+            <w:tcBorders>
+              <w:top w:val="single" w:color="C9D3E3" w:sz="4"/>
+              <w:left w:val="single" w:color="C9D3E3" w:sz="4"/>
+              <w:bottom w:val="single" w:color="C9D3E3" w:sz="4"/>
+              <w:right w:val="single" w:color="C9D3E3" w:sz="4"/>
+            </w:tcBorders>
+            <w:shd w:fill="0D2B56" w:color="auto" w:val="clear"/>
+            <w:tcMar>
+              <w:top w:type="dxa" w:w="60"/>
+              <w:left w:type="dxa" w:w="100"/>
+              <w:bottom w:type="dxa" w:w="60"/>
+              <w:right w:type="dxa" w:w="100"/>
+            </w:tcMar>
+          </w:tcPr>
+          <w:p>
+            <w:pPr>
+              <w:spacing w:after="20" w:line="252"/>
+            </w:pPr>
+            <w:r>
+              <w:rPr>
+                <w:rFonts w:ascii="Nunito" w:cs="Nunito" w:eastAsia="Nunito" w:hAnsi="Nunito"/>
+                <w:b/>
+                <w:bCs/>
+                <w:color w:val="FFFFFF"/>
+                <w:sz w:val="18"/>
+                <w:szCs w:val="18"/>
+              </w:rPr>
+              <w:t xml:space="preserve">Départ possible à partir de</w:t>
+            </w:r>
+          </w:p>
+        </w:tc>
+        <w:tc>
+          <w:tcPr>
+            <w:tcW w:type="dxa" w:w="3300"/>
+            <w:tcBorders>
+              <w:top w:val="single" w:color="C9D3E3" w:sz="4"/>
+              <w:left w:val="single" w:color="C9D3E3" w:sz="4"/>
+              <w:bottom w:val="single" w:color="C9D3E3" w:sz="4"/>
+              <w:right w:val="single" w:color="C9D3E3" w:sz="4"/>
+            </w:tcBorders>
+            <w:shd w:fill="0D2B56" w:color="auto" w:val="clear"/>
+            <w:tcMar>
+              <w:top w:type="dxa" w:w="60"/>
+              <w:left w:type="dxa" w:w="100"/>
+              <w:bottom w:type="dxa" w:w="60"/>
+              <w:right w:type="dxa" w:w="100"/>
+            </w:tcMar>
+          </w:tcPr>
+          <w:p>
+            <w:pPr>
+              <w:spacing w:after="20" w:line="252"/>
+            </w:pPr>
+            <w:r>
+              <w:rPr>
+                <w:rFonts w:ascii="Nunito" w:cs="Nunito" w:eastAsia="Nunito" w:hAnsi="Nunito"/>
+                <w:b/>
+                <w:bCs/>
+                <w:color w:val="FFFFFF"/>
+                <w:sz w:val="18"/>
+                <w:szCs w:val="18"/>
+              </w:rPr>
+              <w:t xml:space="preserve">Né de janvier à septembre</w:t>
+            </w:r>
+          </w:p>
+        </w:tc>
+        <w:tc>
+          <w:tcPr>
+            <w:tcW w:type="dxa" w:w="3338"/>
+            <w:tcBorders>
+              <w:top w:val="single" w:color="C9D3E3" w:sz="4"/>
+              <w:left w:val="single" w:color="C9D3E3" w:sz="4"/>
+              <w:bottom w:val="single" w:color="C9D3E3" w:sz="4"/>
+              <w:right w:val="single" w:color="C9D3E3" w:sz="4"/>
+            </w:tcBorders>
+            <w:shd w:fill="0D2B56" w:color="auto" w:val="clear"/>
+            <w:tcMar>
+              <w:top w:type="dxa" w:w="60"/>
+              <w:left w:type="dxa" w:w="100"/>
+              <w:bottom w:type="dxa" w:w="60"/>
+              <w:right w:type="dxa" w:w="100"/>
+            </w:tcMar>
+          </w:tcPr>
+          <w:p>
+            <w:pPr>
+              <w:spacing w:after="20" w:line="252"/>
+            </w:pPr>
+            <w:r>
+              <w:rPr>
+                <w:rFonts w:ascii="Nunito" w:cs="Nunito" w:eastAsia="Nunito" w:hAnsi="Nunito"/>
+                <w:b/>
+                <w:bCs/>
+                <w:color w:val="FFFFFF"/>
+                <w:sz w:val="18"/>
+                <w:szCs w:val="18"/>
+              </w:rPr>
+              <w:t xml:space="preserve">Né d'octobre à décembre</w:t>
+            </w:r>
+          </w:p>
+        </w:tc>
+      </w:tr>
+      <w:tr>
+        <w:trPr>
+          <w:cantSplit/>
+          <w:tblHeader w:val="off"/>
+        </w:trPr>
+        <w:tc>
+          <w:tcPr>
+            <w:tcW w:type="dxa" w:w="3000"/>
+            <w:tcBorders>
+              <w:top w:val="single" w:color="C9D3E3" w:sz="4"/>
+              <w:left w:val="single" w:color="C9D3E3" w:sz="4"/>
+              <w:bottom w:val="single" w:color="C9D3E3" w:sz="4"/>
+              <w:right w:val="single" w:color="C9D3E3" w:sz="4"/>
+            </w:tcBorders>
+            <w:shd w:fill="E8F1FC" w:color="auto" w:val="clear"/>
+            <w:tcMar>
+              <w:top w:type="dxa" w:w="60"/>
+              <w:left w:type="dxa" w:w="100"/>
+              <w:bottom w:type="dxa" w:w="60"/>
+              <w:right w:type="dxa" w:w="100"/>
+            </w:tcMar>
+          </w:tcPr>
+          <w:p>
+            <w:pPr>
+              <w:spacing w:after="20" w:line="252"/>
+            </w:pPr>
+            <w:r>
+              <w:rPr>
+                <w:rFonts w:ascii="Nunito" w:cs="Nunito" w:eastAsia="Nunito" w:hAnsi="Nunito"/>
+                <w:color w:val="1D2433"/>
+                <w:sz w:val="18"/>
+                <w:szCs w:val="18"/>
+              </w:rPr>
+              <w:t xml:space="preserve">58 ans</w:t>
+            </w:r>
+          </w:p>
+        </w:tc>
+        <w:tc>
+          <w:tcPr>
+            <w:tcW w:type="dxa" w:w="3300"/>
+            <w:tcBorders>
+              <w:top w:val="single" w:color="C9D3E3" w:sz="4"/>
+              <w:left w:val="single" w:color="C9D3E3" w:sz="4"/>
+              <w:bottom w:val="single" w:color="C9D3E3" w:sz="4"/>
+              <w:right w:val="single" w:color="C9D3E3" w:sz="4"/>
+            </w:tcBorders>
+            <w:shd w:fill="E8F1FC" w:color="auto" w:val="clear"/>
+            <w:tcMar>
+              <w:top w:type="dxa" w:w="60"/>
+              <w:left w:type="dxa" w:w="100"/>
+              <w:bottom w:type="dxa" w:w="60"/>
+              <w:right w:type="dxa" w:w="100"/>
+            </w:tcMar>
+          </w:tcPr>
+          <w:p>
+            <w:pPr>
+              <w:spacing w:after="20" w:line="252"/>
+            </w:pPr>
+            <w:r>
+              <w:rPr>
+                <w:rFonts w:ascii="Nunito" w:cs="Nunito" w:eastAsia="Nunito" w:hAnsi="Nunito"/>
+                <w:color w:val="1D2433"/>
+                <w:sz w:val="18"/>
+                <w:szCs w:val="18"/>
+              </w:rPr>
+              <w:t xml:space="preserve">5 trimestres à la fin de l'année des 16 ans</w:t>
+            </w:r>
+          </w:p>
+        </w:tc>
+        <w:tc>
+          <w:tcPr>
+            <w:tcW w:type="dxa" w:w="3338"/>
+            <w:tcBorders>
+              <w:top w:val="single" w:color="C9D3E3" w:sz="4"/>
+              <w:left w:val="single" w:color="C9D3E3" w:sz="4"/>
+              <w:bottom w:val="single" w:color="C9D3E3" w:sz="4"/>
+              <w:right w:val="single" w:color="C9D3E3" w:sz="4"/>
+            </w:tcBorders>
+            <w:shd w:fill="E8F1FC" w:color="auto" w:val="clear"/>
+            <w:tcMar>
+              <w:top w:type="dxa" w:w="60"/>
+              <w:left w:type="dxa" w:w="100"/>
+              <w:bottom w:type="dxa" w:w="60"/>
+              <w:right w:type="dxa" w:w="100"/>
+            </w:tcMar>
+          </w:tcPr>
+          <w:p>
+            <w:pPr>
+              <w:spacing w:after="20" w:line="252"/>
+            </w:pPr>
+            <w:r>
+              <w:rPr>
+                <w:rFonts w:ascii="Nunito" w:cs="Nunito" w:eastAsia="Nunito" w:hAnsi="Nunito"/>
+                <w:color w:val="1D2433"/>
+                <w:sz w:val="18"/>
+                <w:szCs w:val="18"/>
+              </w:rPr>
+              <w:t xml:space="preserve">4 trimestres à la fin de l'année des 16 ans</w:t>
+            </w:r>
+          </w:p>
+        </w:tc>
+      </w:tr>
+      <w:tr>
+        <w:trPr>
+          <w:cantSplit/>
+          <w:tblHeader w:val="off"/>
+        </w:trPr>
+        <w:tc>
+          <w:tcPr>
+            <w:tcW w:type="dxa" w:w="3000"/>
+            <w:tcBorders>
+              <w:top w:val="single" w:color="C9D3E3" w:sz="4"/>
+              <w:left w:val="single" w:color="C9D3E3" w:sz="4"/>
+              <w:bottom w:val="single" w:color="C9D3E3" w:sz="4"/>
+              <w:right w:val="single" w:color="C9D3E3" w:sz="4"/>
+            </w:tcBorders>
+            <w:shd w:fill="FFFFFF" w:color="auto" w:val="clear"/>
+            <w:tcMar>
+              <w:top w:type="dxa" w:w="60"/>
+              <w:left w:type="dxa" w:w="100"/>
+              <w:bottom w:type="dxa" w:w="60"/>
+              <w:right w:type="dxa" w:w="100"/>
+            </w:tcMar>
+          </w:tcPr>
+          <w:p>
+            <w:pPr>
+              <w:spacing w:after="20" w:line="252"/>
+            </w:pPr>
+            <w:r>
+              <w:rPr>
+                <w:rFonts w:ascii="Nunito" w:cs="Nunito" w:eastAsia="Nunito" w:hAnsi="Nunito"/>
+                <w:color w:val="1D2433"/>
+                <w:sz w:val="18"/>
+                <w:szCs w:val="18"/>
+              </w:rPr>
+              <w:t xml:space="preserve">60 ans</w:t>
+            </w:r>
+          </w:p>
+        </w:tc>
+        <w:tc>
+          <w:tcPr>
+            <w:tcW w:type="dxa" w:w="3300"/>
+            <w:tcBorders>
+              <w:top w:val="single" w:color="C9D3E3" w:sz="4"/>
+              <w:left w:val="single" w:color="C9D3E3" w:sz="4"/>
+              <w:bottom w:val="single" w:color="C9D3E3" w:sz="4"/>
+              <w:right w:val="single" w:color="C9D3E3" w:sz="4"/>
+            </w:tcBorders>
+            <w:shd w:fill="FFFFFF" w:color="auto" w:val="clear"/>
+            <w:tcMar>
+              <w:top w:type="dxa" w:w="60"/>
+              <w:left w:type="dxa" w:w="100"/>
+              <w:bottom w:type="dxa" w:w="60"/>
+              <w:right w:type="dxa" w:w="100"/>
+            </w:tcMar>
+          </w:tcPr>
+          <w:p>
+            <w:pPr>
+              <w:spacing w:after="20" w:line="252"/>
+            </w:pPr>
+            <w:r>
+              <w:rPr>
+                <w:rFonts w:ascii="Nunito" w:cs="Nunito" w:eastAsia="Nunito" w:hAnsi="Nunito"/>
+                <w:color w:val="1D2433"/>
+                <w:sz w:val="18"/>
+                <w:szCs w:val="18"/>
+              </w:rPr>
+              <w:t xml:space="preserve">5 trimestres à la fin de l'année des 18 ans</w:t>
+            </w:r>
+          </w:p>
+        </w:tc>
+        <w:tc>
+          <w:tcPr>
+            <w:tcW w:type="dxa" w:w="3338"/>
+            <w:tcBorders>
+              <w:top w:val="single" w:color="C9D3E3" w:sz="4"/>
+              <w:left w:val="single" w:color="C9D3E3" w:sz="4"/>
+              <w:bottom w:val="single" w:color="C9D3E3" w:sz="4"/>
+              <w:right w:val="single" w:color="C9D3E3" w:sz="4"/>
+            </w:tcBorders>
+            <w:shd w:fill="FFFFFF" w:color="auto" w:val="clear"/>
+            <w:tcMar>
+              <w:top w:type="dxa" w:w="60"/>
+              <w:left w:type="dxa" w:w="100"/>
+              <w:bottom w:type="dxa" w:w="60"/>
+              <w:right w:type="dxa" w:w="100"/>
+            </w:tcMar>
+          </w:tcPr>
+          <w:p>
+            <w:pPr>
+              <w:spacing w:after="20" w:line="252"/>
+            </w:pPr>
+            <w:r>
+              <w:rPr>
+                <w:rFonts w:ascii="Nunito" w:cs="Nunito" w:eastAsia="Nunito" w:hAnsi="Nunito"/>
+                <w:color w:val="1D2433"/>
+                <w:sz w:val="18"/>
+                <w:szCs w:val="18"/>
+              </w:rPr>
+              <w:t xml:space="preserve">4 trimestres à la fin de l'année des 18 ans</w:t>
+            </w:r>
+          </w:p>
+        </w:tc>
+      </w:tr>
+      <w:tr>
+        <w:trPr>
+          <w:cantSplit/>
+          <w:tblHeader w:val="off"/>
+        </w:trPr>
+        <w:tc>
+          <w:tcPr>
+            <w:tcW w:type="dxa" w:w="3000"/>
+            <w:tcBorders>
+              <w:top w:val="single" w:color="C9D3E3" w:sz="4"/>
+              <w:left w:val="single" w:color="C9D3E3" w:sz="4"/>
+              <w:bottom w:val="single" w:color="C9D3E3" w:sz="4"/>
+              <w:right w:val="single" w:color="C9D3E3" w:sz="4"/>
+            </w:tcBorders>
+            <w:shd w:fill="E8F1FC" w:color="auto" w:val="clear"/>
+            <w:tcMar>
+              <w:top w:type="dxa" w:w="60"/>
+              <w:left w:type="dxa" w:w="100"/>
+              <w:bottom w:type="dxa" w:w="60"/>
+              <w:right w:type="dxa" w:w="100"/>
+            </w:tcMar>
+          </w:tcPr>
+          <w:p>
+            <w:pPr>
+              <w:spacing w:after="20" w:line="252"/>
+            </w:pPr>
+            <w:r>
+              <w:rPr>
+                <w:rFonts w:ascii="Nunito" w:cs="Nunito" w:eastAsia="Nunito" w:hAnsi="Nunito"/>
+                <w:color w:val="1D2433"/>
+                <w:sz w:val="18"/>
+                <w:szCs w:val="18"/>
+              </w:rPr>
+              <w:t xml:space="preserve">Âge du tableau « avant 20 ans »</w:t>
+            </w:r>
+          </w:p>
+        </w:tc>
+        <w:tc>
+          <w:tcPr>
+            <w:tcW w:type="dxa" w:w="3300"/>
+            <w:tcBorders>
+              <w:top w:val="single" w:color="C9D3E3" w:sz="4"/>
+              <w:left w:val="single" w:color="C9D3E3" w:sz="4"/>
+              <w:bottom w:val="single" w:color="C9D3E3" w:sz="4"/>
+              <w:right w:val="single" w:color="C9D3E3" w:sz="4"/>
+            </w:tcBorders>
+            <w:shd w:fill="E8F1FC" w:color="auto" w:val="clear"/>
+            <w:tcMar>
+              <w:top w:type="dxa" w:w="60"/>
+              <w:left w:type="dxa" w:w="100"/>
+              <w:bottom w:type="dxa" w:w="60"/>
+              <w:right w:type="dxa" w:w="100"/>
+            </w:tcMar>
+          </w:tcPr>
+          <w:p>
+            <w:pPr>
+              <w:spacing w:after="20" w:line="252"/>
+            </w:pPr>
+            <w:r>
+              <w:rPr>
+                <w:rFonts w:ascii="Nunito" w:cs="Nunito" w:eastAsia="Nunito" w:hAnsi="Nunito"/>
+                <w:color w:val="1D2433"/>
+                <w:sz w:val="18"/>
+                <w:szCs w:val="18"/>
+              </w:rPr>
+              <w:t xml:space="preserve">5 trimestres à la fin de l'année des 20 ans</w:t>
+            </w:r>
+          </w:p>
+        </w:tc>
+        <w:tc>
+          <w:tcPr>
+            <w:tcW w:type="dxa" w:w="3338"/>
+            <w:tcBorders>
+              <w:top w:val="single" w:color="C9D3E3" w:sz="4"/>
+              <w:left w:val="single" w:color="C9D3E3" w:sz="4"/>
+              <w:bottom w:val="single" w:color="C9D3E3" w:sz="4"/>
+              <w:right w:val="single" w:color="C9D3E3" w:sz="4"/>
+            </w:tcBorders>
+            <w:shd w:fill="E8F1FC" w:color="auto" w:val="clear"/>
+            <w:tcMar>
+              <w:top w:type="dxa" w:w="60"/>
+              <w:left w:type="dxa" w:w="100"/>
+              <w:bottom w:type="dxa" w:w="60"/>
+              <w:right w:type="dxa" w:w="100"/>
+            </w:tcMar>
+          </w:tcPr>
+          <w:p>
+            <w:pPr>
+              <w:spacing w:after="20" w:line="252"/>
+            </w:pPr>
+            <w:r>
+              <w:rPr>
+                <w:rFonts w:ascii="Nunito" w:cs="Nunito" w:eastAsia="Nunito" w:hAnsi="Nunito"/>
+                <w:color w:val="1D2433"/>
+                <w:sz w:val="18"/>
+                <w:szCs w:val="18"/>
+              </w:rPr>
+              <w:t xml:space="preserve">4 trimestres à la fin de l'année des 20 ans</w:t>
+            </w:r>
+          </w:p>
+        </w:tc>
+      </w:tr>
+      <w:tr>
+        <w:trPr>
+          <w:cantSplit/>
+          <w:tblHeader w:val="off"/>
+        </w:trPr>
+        <w:tc>
+          <w:tcPr>
+            <w:tcW w:type="dxa" w:w="3000"/>
+            <w:tcBorders>
+              <w:top w:val="single" w:color="C9D3E3" w:sz="4"/>
+              <w:left w:val="single" w:color="C9D3E3" w:sz="4"/>
+              <w:bottom w:val="single" w:color="C9D3E3" w:sz="4"/>
+              <w:right w:val="single" w:color="C9D3E3" w:sz="4"/>
+            </w:tcBorders>
+            <w:shd w:fill="FFFFFF" w:color="auto" w:val="clear"/>
+            <w:tcMar>
+              <w:top w:type="dxa" w:w="60"/>
+              <w:left w:type="dxa" w:w="100"/>
+              <w:bottom w:type="dxa" w:w="60"/>
+              <w:right w:type="dxa" w:w="100"/>
+            </w:tcMar>
+          </w:tcPr>
+          <w:p>
+            <w:pPr>
+              <w:spacing w:after="20" w:line="252"/>
+            </w:pPr>
+            <w:r>
+              <w:rPr>
+                <w:rFonts w:ascii="Nunito" w:cs="Nunito" w:eastAsia="Nunito" w:hAnsi="Nunito"/>
+                <w:color w:val="1D2433"/>
+                <w:sz w:val="18"/>
+                <w:szCs w:val="18"/>
+              </w:rPr>
+              <w:t xml:space="preserve">63 ans</w:t>
+            </w:r>
+          </w:p>
+        </w:tc>
+        <w:tc>
+          <w:tcPr>
+            <w:tcW w:type="dxa" w:w="3300"/>
+            <w:tcBorders>
+              <w:top w:val="single" w:color="C9D3E3" w:sz="4"/>
+              <w:left w:val="single" w:color="C9D3E3" w:sz="4"/>
+              <w:bottom w:val="single" w:color="C9D3E3" w:sz="4"/>
+              <w:right w:val="single" w:color="C9D3E3" w:sz="4"/>
+            </w:tcBorders>
+            <w:shd w:fill="FFFFFF" w:color="auto" w:val="clear"/>
+            <w:tcMar>
+              <w:top w:type="dxa" w:w="60"/>
+              <w:left w:type="dxa" w:w="100"/>
+              <w:bottom w:type="dxa" w:w="60"/>
+              <w:right w:type="dxa" w:w="100"/>
+            </w:tcMar>
+          </w:tcPr>
+          <w:p>
+            <w:pPr>
+              <w:spacing w:after="20" w:line="252"/>
+            </w:pPr>
+            <w:r>
+              <w:rPr>
+                <w:rFonts w:ascii="Nunito" w:cs="Nunito" w:eastAsia="Nunito" w:hAnsi="Nunito"/>
+                <w:color w:val="1D2433"/>
+                <w:sz w:val="18"/>
+                <w:szCs w:val="18"/>
+              </w:rPr>
+              <w:t xml:space="preserve">5 trimestres à la fin de l'année des 21 ans</w:t>
+            </w:r>
+          </w:p>
+        </w:tc>
+        <w:tc>
+          <w:tcPr>
+            <w:tcW w:type="dxa" w:w="3338"/>
+            <w:tcBorders>
+              <w:top w:val="single" w:color="C9D3E3" w:sz="4"/>
+              <w:left w:val="single" w:color="C9D3E3" w:sz="4"/>
+              <w:bottom w:val="single" w:color="C9D3E3" w:sz="4"/>
+              <w:right w:val="single" w:color="C9D3E3" w:sz="4"/>
+            </w:tcBorders>
+            <w:shd w:fill="FFFFFF" w:color="auto" w:val="clear"/>
+            <w:tcMar>
+              <w:top w:type="dxa" w:w="60"/>
+              <w:left w:type="dxa" w:w="100"/>
+              <w:bottom w:type="dxa" w:w="60"/>
+              <w:right w:type="dxa" w:w="100"/>
+            </w:tcMar>
+          </w:tcPr>
+          <w:p>
+            <w:pPr>
+              <w:spacing w:after="20" w:line="252"/>
+            </w:pPr>
+            <w:r>
+              <w:rPr>
+                <w:rFonts w:ascii="Nunito" w:cs="Nunito" w:eastAsia="Nunito" w:hAnsi="Nunito"/>
+                <w:color w:val="1D2433"/>
+                <w:sz w:val="18"/>
+                <w:szCs w:val="18"/>
+              </w:rPr>
+              <w:t xml:space="preserve">4 trimestres à la fin de l'année des 21 ans</w:t>
+            </w:r>
+          </w:p>
+        </w:tc>
+      </w:tr>
+    </w:tbl>
+    <w:p>
+      <w:pPr>
+        <w:pStyle w:val="Heading2"/>
+        <w:keepNext/>
+        <w:spacing w:after="100" w:before="240"/>
+      </w:pPr>
+      <w:r>
+        <w:rPr>
+          <w:rFonts w:ascii="Fraunces" w:cs="Fraunces" w:eastAsia="Fraunces" w:hAnsi="Fraunces"/>
+          <w:b/>
+          <w:bCs/>
+          <w:color w:val="0D2B56"/>
+          <w:sz w:val="25"/>
+          <w:szCs w:val="25"/>
+        </w:rPr>
+        <w:t xml:space="preserve">Condition 2 — âge et durée cotisée, pensions prenant effet depuis le 01/09/2026</w:t>
+      </w:r>
+    </w:p>
+    <w:tbl>
+      <w:tblPr>
+        <w:tblW w:type="dxa" w:w="9638"/>
+        <w:tblBorders>
+          <w:top w:val="single" w:color="auto" w:sz="4"/>
+          <w:left w:val="single" w:color="auto" w:sz="4"/>
+          <w:bottom w:val="single" w:color="auto" w:sz="4"/>
+          <w:right w:val="single" w:color="auto" w:sz="4"/>
+          <w:insideH w:val="single" w:color="auto" w:sz="4"/>
+          <w:insideV w:val="single" w:color="auto" w:sz="4"/>
+        </w:tblBorders>
+      </w:tblPr>
+      <w:tblGrid>
+        <w:gridCol w:w="2300"/>
+        <w:gridCol w:w="1500"/>
+        <w:gridCol w:w="1400"/>
+        <w:gridCol w:w="1700"/>
+        <w:gridCol w:w="1300"/>
+        <w:gridCol w:w="1438"/>
+      </w:tblGrid>
+      <w:tr>
+        <w:trPr>
+          <w:cantSplit/>
+          <w:tblHeader/>
+        </w:trPr>
+        <w:tc>
+          <w:tcPr>
+            <w:tcW w:type="dxa" w:w="2300"/>
+            <w:tcBorders>
+              <w:top w:val="single" w:color="C9D3E3" w:sz="4"/>
+              <w:left w:val="single" w:color="C9D3E3" w:sz="4"/>
+              <w:bottom w:val="single" w:color="C9D3E3" w:sz="4"/>
+              <w:right w:val="single" w:color="C9D3E3" w:sz="4"/>
+            </w:tcBorders>
+            <w:shd w:fill="0D2B56" w:color="auto" w:val="clear"/>
+            <w:tcMar>
+              <w:top w:type="dxa" w:w="60"/>
+              <w:left w:type="dxa" w:w="100"/>
+              <w:bottom w:type="dxa" w:w="60"/>
+              <w:right w:type="dxa" w:w="100"/>
+            </w:tcMar>
+          </w:tcPr>
+          <w:p>
+            <w:pPr>
+              <w:spacing w:after="20" w:line="252"/>
+            </w:pPr>
+            <w:r>
+              <w:rPr>
+                <w:rFonts w:ascii="Nunito" w:cs="Nunito" w:eastAsia="Nunito" w:hAnsi="Nunito"/>
+                <w:b/>
+                <w:bCs/>
+                <w:color w:val="FFFFFF"/>
+                <w:sz w:val="18"/>
+                <w:szCs w:val="18"/>
+              </w:rPr>
+              <w:t xml:space="preserve">Génération</w:t>
+            </w:r>
+          </w:p>
+        </w:tc>
+        <w:tc>
+          <w:tcPr>
+            <w:tcW w:type="dxa" w:w="1500"/>
+            <w:tcBorders>
+              <w:top w:val="single" w:color="C9D3E3" w:sz="4"/>
+              <w:left w:val="single" w:color="C9D3E3" w:sz="4"/>
+              <w:bottom w:val="single" w:color="C9D3E3" w:sz="4"/>
+              <w:right w:val="single" w:color="C9D3E3" w:sz="4"/>
+            </w:tcBorders>
+            <w:shd w:fill="0D2B56" w:color="auto" w:val="clear"/>
+            <w:tcMar>
+              <w:top w:type="dxa" w:w="60"/>
+              <w:left w:type="dxa" w:w="100"/>
+              <w:bottom w:type="dxa" w:w="60"/>
+              <w:right w:type="dxa" w:w="100"/>
+            </w:tcMar>
+          </w:tcPr>
+          <w:p>
+            <w:pPr>
+              <w:spacing w:after="20" w:line="252"/>
+            </w:pPr>
+            <w:r>
+              <w:rPr>
+                <w:rFonts w:ascii="Nunito" w:cs="Nunito" w:eastAsia="Nunito" w:hAnsi="Nunito"/>
+                <w:b/>
+                <w:bCs/>
+                <w:color w:val="FFFFFF"/>
+                <w:sz w:val="18"/>
+                <w:szCs w:val="18"/>
+              </w:rPr>
+              <w:t xml:space="preserve">Début avant 16 ans</w:t>
+            </w:r>
+          </w:p>
+        </w:tc>
+        <w:tc>
+          <w:tcPr>
+            <w:tcW w:type="dxa" w:w="1400"/>
+            <w:tcBorders>
+              <w:top w:val="single" w:color="C9D3E3" w:sz="4"/>
+              <w:left w:val="single" w:color="C9D3E3" w:sz="4"/>
+              <w:bottom w:val="single" w:color="C9D3E3" w:sz="4"/>
+              <w:right w:val="single" w:color="C9D3E3" w:sz="4"/>
+            </w:tcBorders>
+            <w:shd w:fill="0D2B56" w:color="auto" w:val="clear"/>
+            <w:tcMar>
+              <w:top w:type="dxa" w:w="60"/>
+              <w:left w:type="dxa" w:w="100"/>
+              <w:bottom w:type="dxa" w:w="60"/>
+              <w:right w:type="dxa" w:w="100"/>
+            </w:tcMar>
+          </w:tcPr>
+          <w:p>
+            <w:pPr>
+              <w:spacing w:after="20" w:line="252"/>
+            </w:pPr>
+            <w:r>
+              <w:rPr>
+                <w:rFonts w:ascii="Nunito" w:cs="Nunito" w:eastAsia="Nunito" w:hAnsi="Nunito"/>
+                <w:b/>
+                <w:bCs/>
+                <w:color w:val="FFFFFF"/>
+                <w:sz w:val="18"/>
+                <w:szCs w:val="18"/>
+              </w:rPr>
+              <w:t xml:space="preserve">Avant 18 ans</w:t>
+            </w:r>
+          </w:p>
+        </w:tc>
+        <w:tc>
+          <w:tcPr>
+            <w:tcW w:type="dxa" w:w="1700"/>
+            <w:tcBorders>
+              <w:top w:val="single" w:color="C9D3E3" w:sz="4"/>
+              <w:left w:val="single" w:color="C9D3E3" w:sz="4"/>
+              <w:bottom w:val="single" w:color="C9D3E3" w:sz="4"/>
+              <w:right w:val="single" w:color="C9D3E3" w:sz="4"/>
+            </w:tcBorders>
+            <w:shd w:fill="0D2B56" w:color="auto" w:val="clear"/>
+            <w:tcMar>
+              <w:top w:type="dxa" w:w="60"/>
+              <w:left w:type="dxa" w:w="100"/>
+              <w:bottom w:type="dxa" w:w="60"/>
+              <w:right w:type="dxa" w:w="100"/>
+            </w:tcMar>
+          </w:tcPr>
+          <w:p>
+            <w:pPr>
+              <w:spacing w:after="20" w:line="252"/>
+            </w:pPr>
+            <w:r>
+              <w:rPr>
+                <w:rFonts w:ascii="Nunito" w:cs="Nunito" w:eastAsia="Nunito" w:hAnsi="Nunito"/>
+                <w:b/>
+                <w:bCs/>
+                <w:color w:val="FFFFFF"/>
+                <w:sz w:val="18"/>
+                <w:szCs w:val="18"/>
+              </w:rPr>
+              <w:t xml:space="preserve">Avant 20 ans</w:t>
+            </w:r>
+          </w:p>
+        </w:tc>
+        <w:tc>
+          <w:tcPr>
+            <w:tcW w:type="dxa" w:w="1300"/>
+            <w:tcBorders>
+              <w:top w:val="single" w:color="C9D3E3" w:sz="4"/>
+              <w:left w:val="single" w:color="C9D3E3" w:sz="4"/>
+              <w:bottom w:val="single" w:color="C9D3E3" w:sz="4"/>
+              <w:right w:val="single" w:color="C9D3E3" w:sz="4"/>
+            </w:tcBorders>
+            <w:shd w:fill="0D2B56" w:color="auto" w:val="clear"/>
+            <w:tcMar>
+              <w:top w:type="dxa" w:w="60"/>
+              <w:left w:type="dxa" w:w="100"/>
+              <w:bottom w:type="dxa" w:w="60"/>
+              <w:right w:type="dxa" w:w="100"/>
+            </w:tcMar>
+          </w:tcPr>
+          <w:p>
+            <w:pPr>
+              <w:spacing w:after="20" w:line="252"/>
+            </w:pPr>
+            <w:r>
+              <w:rPr>
+                <w:rFonts w:ascii="Nunito" w:cs="Nunito" w:eastAsia="Nunito" w:hAnsi="Nunito"/>
+                <w:b/>
+                <w:bCs/>
+                <w:color w:val="FFFFFF"/>
+                <w:sz w:val="18"/>
+                <w:szCs w:val="18"/>
+              </w:rPr>
+              <w:t xml:space="preserve">Avant 21 ans</w:t>
+            </w:r>
+          </w:p>
+        </w:tc>
+        <w:tc>
+          <w:tcPr>
+            <w:tcW w:type="dxa" w:w="1438"/>
+            <w:tcBorders>
+              <w:top w:val="single" w:color="C9D3E3" w:sz="4"/>
+              <w:left w:val="single" w:color="C9D3E3" w:sz="4"/>
+              <w:bottom w:val="single" w:color="C9D3E3" w:sz="4"/>
+              <w:right w:val="single" w:color="C9D3E3" w:sz="4"/>
+            </w:tcBorders>
+            <w:shd w:fill="0D2B56" w:color="auto" w:val="clear"/>
+            <w:tcMar>
+              <w:top w:type="dxa" w:w="60"/>
+              <w:left w:type="dxa" w:w="100"/>
+              <w:bottom w:type="dxa" w:w="60"/>
+              <w:right w:type="dxa" w:w="100"/>
+            </w:tcMar>
+          </w:tcPr>
+          <w:p>
+            <w:pPr>
+              <w:spacing w:after="20" w:line="252"/>
+            </w:pPr>
+            <w:r>
+              <w:rPr>
+                <w:rFonts w:ascii="Nunito" w:cs="Nunito" w:eastAsia="Nunito" w:hAnsi="Nunito"/>
+                <w:b/>
+                <w:bCs/>
+                <w:color w:val="FFFFFF"/>
+                <w:sz w:val="18"/>
+                <w:szCs w:val="18"/>
+              </w:rPr>
+              <w:t xml:space="preserve">Durée cotisée</w:t>
+            </w:r>
+          </w:p>
+        </w:tc>
+      </w:tr>
+      <w:tr>
+        <w:trPr>
+          <w:cantSplit/>
+          <w:tblHeader w:val="off"/>
+        </w:trPr>
+        <w:tc>
+          <w:tcPr>
+            <w:tcW w:type="dxa" w:w="2300"/>
+            <w:tcBorders>
+              <w:top w:val="single" w:color="C9D3E3" w:sz="4"/>
+              <w:left w:val="single" w:color="C9D3E3" w:sz="4"/>
+              <w:bottom w:val="single" w:color="C9D3E3" w:sz="4"/>
+              <w:right w:val="single" w:color="C9D3E3" w:sz="4"/>
+            </w:tcBorders>
+            <w:shd w:fill="E8F1FC" w:color="auto" w:val="clear"/>
+            <w:tcMar>
+              <w:top w:type="dxa" w:w="60"/>
+              <w:left w:type="dxa" w:w="100"/>
+              <w:bottom w:type="dxa" w:w="60"/>
+              <w:right w:type="dxa" w:w="100"/>
+            </w:tcMar>
+          </w:tcPr>
+          <w:p>
+            <w:pPr>
+              <w:spacing w:after="20" w:line="252"/>
+            </w:pPr>
+            <w:r>
+              <w:rPr>
+                <w:rFonts w:ascii="Nunito" w:cs="Nunito" w:eastAsia="Nunito" w:hAnsi="Nunito"/>
+                <w:color w:val="1D2433"/>
+                <w:sz w:val="18"/>
+                <w:szCs w:val="18"/>
+              </w:rPr>
+              <w:t xml:space="preserve">1963 (sept. – déc.)</w:t>
+            </w:r>
+          </w:p>
+        </w:tc>
+        <w:tc>
+          <w:tcPr>
+            <w:tcW w:type="dxa" w:w="1500"/>
+            <w:tcBorders>
+              <w:top w:val="single" w:color="C9D3E3" w:sz="4"/>
+              <w:left w:val="single" w:color="C9D3E3" w:sz="4"/>
+              <w:bottom w:val="single" w:color="C9D3E3" w:sz="4"/>
+              <w:right w:val="single" w:color="C9D3E3" w:sz="4"/>
+            </w:tcBorders>
+            <w:shd w:fill="E8F1FC" w:color="auto" w:val="clear"/>
+            <w:tcMar>
+              <w:top w:type="dxa" w:w="60"/>
+              <w:left w:type="dxa" w:w="100"/>
+              <w:bottom w:type="dxa" w:w="60"/>
+              <w:right w:type="dxa" w:w="100"/>
+            </w:tcMar>
+          </w:tcPr>
+          <w:p>
+            <w:pPr>
+              <w:spacing w:after="20" w:line="252"/>
+            </w:pPr>
+            <w:r>
+              <w:rPr>
+                <w:rFonts w:ascii="Nunito" w:cs="Nunito" w:eastAsia="Nunito" w:hAnsi="Nunito"/>
+                <w:color w:val="1D2433"/>
+                <w:sz w:val="18"/>
+                <w:szCs w:val="18"/>
+              </w:rPr>
+              <w:t xml:space="preserve">58 ans</w:t>
+            </w:r>
+          </w:p>
+        </w:tc>
+        <w:tc>
+          <w:tcPr>
+            <w:tcW w:type="dxa" w:w="1400"/>
+            <w:tcBorders>
+              <w:top w:val="single" w:color="C9D3E3" w:sz="4"/>
+              <w:left w:val="single" w:color="C9D3E3" w:sz="4"/>
+              <w:bottom w:val="single" w:color="C9D3E3" w:sz="4"/>
+              <w:right w:val="single" w:color="C9D3E3" w:sz="4"/>
+            </w:tcBorders>
+            <w:shd w:fill="E8F1FC" w:color="auto" w:val="clear"/>
+            <w:tcMar>
+              <w:top w:type="dxa" w:w="60"/>
+              <w:left w:type="dxa" w:w="100"/>
+              <w:bottom w:type="dxa" w:w="60"/>
+              <w:right w:type="dxa" w:w="100"/>
+            </w:tcMar>
+          </w:tcPr>
+          <w:p>
+            <w:pPr>
+              <w:spacing w:after="20" w:line="252"/>
+            </w:pPr>
+            <w:r>
+              <w:rPr>
+                <w:rFonts w:ascii="Nunito" w:cs="Nunito" w:eastAsia="Nunito" w:hAnsi="Nunito"/>
+                <w:color w:val="1D2433"/>
+                <w:sz w:val="18"/>
+                <w:szCs w:val="18"/>
+              </w:rPr>
+              <w:t xml:space="preserve">60 ans</w:t>
+            </w:r>
+          </w:p>
+        </w:tc>
+        <w:tc>
+          <w:tcPr>
+            <w:tcW w:type="dxa" w:w="1700"/>
+            <w:tcBorders>
+              <w:top w:val="single" w:color="C9D3E3" w:sz="4"/>
+              <w:left w:val="single" w:color="C9D3E3" w:sz="4"/>
+              <w:bottom w:val="single" w:color="C9D3E3" w:sz="4"/>
+              <w:right w:val="single" w:color="C9D3E3" w:sz="4"/>
+            </w:tcBorders>
+            <w:shd w:fill="E8F1FC" w:color="auto" w:val="clear"/>
+            <w:tcMar>
+              <w:top w:type="dxa" w:w="60"/>
+              <w:left w:type="dxa" w:w="100"/>
+              <w:bottom w:type="dxa" w:w="60"/>
+              <w:right w:type="dxa" w:w="100"/>
+            </w:tcMar>
+          </w:tcPr>
+          <w:p>
+            <w:pPr>
+              <w:spacing w:after="20" w:line="252"/>
+            </w:pPr>
+            <w:r>
+              <w:rPr>
+                <w:rFonts w:ascii="Nunito" w:cs="Nunito" w:eastAsia="Nunito" w:hAnsi="Nunito"/>
+                <w:color w:val="1D2433"/>
+                <w:sz w:val="18"/>
+                <w:szCs w:val="18"/>
+              </w:rPr>
+              <w:t xml:space="preserve">60 ans 3 mois</w:t>
+            </w:r>
+          </w:p>
+        </w:tc>
+        <w:tc>
+          <w:tcPr>
+            <w:tcW w:type="dxa" w:w="1300"/>
+            <w:tcBorders>
+              <w:top w:val="single" w:color="C9D3E3" w:sz="4"/>
+              <w:left w:val="single" w:color="C9D3E3" w:sz="4"/>
+              <w:bottom w:val="single" w:color="C9D3E3" w:sz="4"/>
+              <w:right w:val="single" w:color="C9D3E3" w:sz="4"/>
+            </w:tcBorders>
+            <w:shd w:fill="E8F1FC" w:color="auto" w:val="clear"/>
+            <w:tcMar>
+              <w:top w:type="dxa" w:w="60"/>
+              <w:left w:type="dxa" w:w="100"/>
+              <w:bottom w:type="dxa" w:w="60"/>
+              <w:right w:type="dxa" w:w="100"/>
+            </w:tcMar>
+          </w:tcPr>
+          <w:p>
+            <w:pPr>
+              <w:spacing w:after="20" w:line="252"/>
+            </w:pPr>
+            <w:r>
+              <w:rPr>
+                <w:rFonts w:ascii="Nunito" w:cs="Nunito" w:eastAsia="Nunito" w:hAnsi="Nunito"/>
+                <w:color w:val="1D2433"/>
+                <w:sz w:val="18"/>
+                <w:szCs w:val="18"/>
+              </w:rPr>
+              <w:t xml:space="preserve">—</w:t>
+            </w:r>
+          </w:p>
+        </w:tc>
+        <w:tc>
+          <w:tcPr>
+            <w:tcW w:type="dxa" w:w="1438"/>
+            <w:tcBorders>
+              <w:top w:val="single" w:color="C9D3E3" w:sz="4"/>
+              <w:left w:val="single" w:color="C9D3E3" w:sz="4"/>
+              <w:bottom w:val="single" w:color="C9D3E3" w:sz="4"/>
+              <w:right w:val="single" w:color="C9D3E3" w:sz="4"/>
+            </w:tcBorders>
+            <w:shd w:fill="E8F1FC" w:color="auto" w:val="clear"/>
+            <w:tcMar>
+              <w:top w:type="dxa" w:w="60"/>
+              <w:left w:type="dxa" w:w="100"/>
+              <w:bottom w:type="dxa" w:w="60"/>
+              <w:right w:type="dxa" w:w="100"/>
+            </w:tcMar>
+          </w:tcPr>
+          <w:p>
+            <w:pPr>
+              <w:spacing w:after="20" w:line="252"/>
+            </w:pPr>
+            <w:r>
+              <w:rPr>
+                <w:rFonts w:ascii="Nunito" w:cs="Nunito" w:eastAsia="Nunito" w:hAnsi="Nunito"/>
+                <w:color w:val="1D2433"/>
+                <w:sz w:val="18"/>
+                <w:szCs w:val="18"/>
+              </w:rPr>
+              <w:t xml:space="preserve">170</w:t>
+            </w:r>
+          </w:p>
+        </w:tc>
+      </w:tr>
+      <w:tr>
+        <w:trPr>
+          <w:cantSplit/>
+          <w:tblHeader w:val="off"/>
+        </w:trPr>
+        <w:tc>
+          <w:tcPr>
+            <w:tcW w:type="dxa" w:w="2300"/>
+            <w:tcBorders>
+              <w:top w:val="single" w:color="C9D3E3" w:sz="4"/>
+              <w:left w:val="single" w:color="C9D3E3" w:sz="4"/>
+              <w:bottom w:val="single" w:color="C9D3E3" w:sz="4"/>
+              <w:right w:val="single" w:color="C9D3E3" w:sz="4"/>
+            </w:tcBorders>
+            <w:shd w:fill="FFFFFF" w:color="auto" w:val="clear"/>
+            <w:tcMar>
+              <w:top w:type="dxa" w:w="60"/>
+              <w:left w:type="dxa" w:w="100"/>
+              <w:bottom w:type="dxa" w:w="60"/>
+              <w:right w:type="dxa" w:w="100"/>
+            </w:tcMar>
+          </w:tcPr>
+          <w:p>
+            <w:pPr>
+              <w:spacing w:after="20" w:line="252"/>
+            </w:pPr>
+            <w:r>
+              <w:rPr>
+                <w:rFonts w:ascii="Nunito" w:cs="Nunito" w:eastAsia="Nunito" w:hAnsi="Nunito"/>
+                <w:color w:val="1D2433"/>
+                <w:sz w:val="18"/>
+                <w:szCs w:val="18"/>
+              </w:rPr>
+              <w:t xml:space="preserve">1964</w:t>
+            </w:r>
+          </w:p>
+        </w:tc>
+        <w:tc>
+          <w:tcPr>
+            <w:tcW w:type="dxa" w:w="1500"/>
+            <w:tcBorders>
+              <w:top w:val="single" w:color="C9D3E3" w:sz="4"/>
+              <w:left w:val="single" w:color="C9D3E3" w:sz="4"/>
+              <w:bottom w:val="single" w:color="C9D3E3" w:sz="4"/>
+              <w:right w:val="single" w:color="C9D3E3" w:sz="4"/>
+            </w:tcBorders>
+            <w:shd w:fill="FFFFFF" w:color="auto" w:val="clear"/>
+            <w:tcMar>
+              <w:top w:type="dxa" w:w="60"/>
+              <w:left w:type="dxa" w:w="100"/>
+              <w:bottom w:type="dxa" w:w="60"/>
+              <w:right w:type="dxa" w:w="100"/>
+            </w:tcMar>
+          </w:tcPr>
+          <w:p>
+            <w:pPr>
+              <w:spacing w:after="20" w:line="252"/>
+            </w:pPr>
+            <w:r>
+              <w:rPr>
+                <w:rFonts w:ascii="Nunito" w:cs="Nunito" w:eastAsia="Nunito" w:hAnsi="Nunito"/>
+                <w:color w:val="1D2433"/>
+                <w:sz w:val="18"/>
+                <w:szCs w:val="18"/>
+              </w:rPr>
+              <w:t xml:space="preserve">58 ans</w:t>
+            </w:r>
+          </w:p>
+        </w:tc>
+        <w:tc>
+          <w:tcPr>
+            <w:tcW w:type="dxa" w:w="1400"/>
+            <w:tcBorders>
+              <w:top w:val="single" w:color="C9D3E3" w:sz="4"/>
+              <w:left w:val="single" w:color="C9D3E3" w:sz="4"/>
+              <w:bottom w:val="single" w:color="C9D3E3" w:sz="4"/>
+              <w:right w:val="single" w:color="C9D3E3" w:sz="4"/>
+            </w:tcBorders>
+            <w:shd w:fill="FFFFFF" w:color="auto" w:val="clear"/>
+            <w:tcMar>
+              <w:top w:type="dxa" w:w="60"/>
+              <w:left w:type="dxa" w:w="100"/>
+              <w:bottom w:type="dxa" w:w="60"/>
+              <w:right w:type="dxa" w:w="100"/>
+            </w:tcMar>
+          </w:tcPr>
+          <w:p>
+            <w:pPr>
+              <w:spacing w:after="20" w:line="252"/>
+            </w:pPr>
+            <w:r>
+              <w:rPr>
+                <w:rFonts w:ascii="Nunito" w:cs="Nunito" w:eastAsia="Nunito" w:hAnsi="Nunito"/>
+                <w:color w:val="1D2433"/>
+                <w:sz w:val="18"/>
+                <w:szCs w:val="18"/>
+              </w:rPr>
+              <w:t xml:space="preserve">60 ans</w:t>
+            </w:r>
+          </w:p>
+        </w:tc>
+        <w:tc>
+          <w:tcPr>
+            <w:tcW w:type="dxa" w:w="1700"/>
+            <w:tcBorders>
+              <w:top w:val="single" w:color="C9D3E3" w:sz="4"/>
+              <w:left w:val="single" w:color="C9D3E3" w:sz="4"/>
+              <w:bottom w:val="single" w:color="C9D3E3" w:sz="4"/>
+              <w:right w:val="single" w:color="C9D3E3" w:sz="4"/>
+            </w:tcBorders>
+            <w:shd w:fill="FFFFFF" w:color="auto" w:val="clear"/>
+            <w:tcMar>
+              <w:top w:type="dxa" w:w="60"/>
+              <w:left w:type="dxa" w:w="100"/>
+              <w:bottom w:type="dxa" w:w="60"/>
+              <w:right w:type="dxa" w:w="100"/>
+            </w:tcMar>
+          </w:tcPr>
+          <w:p>
+            <w:pPr>
+              <w:spacing w:after="20" w:line="252"/>
+            </w:pPr>
+            <w:r>
+              <w:rPr>
+                <w:rFonts w:ascii="Nunito" w:cs="Nunito" w:eastAsia="Nunito" w:hAnsi="Nunito"/>
+                <w:color w:val="1D2433"/>
+                <w:sz w:val="18"/>
+                <w:szCs w:val="18"/>
+              </w:rPr>
+              <w:t xml:space="preserve">60 ans 6 mois</w:t>
+            </w:r>
+          </w:p>
+        </w:tc>
+        <w:tc>
+          <w:tcPr>
+            <w:tcW w:type="dxa" w:w="1300"/>
+            <w:tcBorders>
+              <w:top w:val="single" w:color="C9D3E3" w:sz="4"/>
+              <w:left w:val="single" w:color="C9D3E3" w:sz="4"/>
+              <w:bottom w:val="single" w:color="C9D3E3" w:sz="4"/>
+              <w:right w:val="single" w:color="C9D3E3" w:sz="4"/>
+            </w:tcBorders>
+            <w:shd w:fill="FFFFFF" w:color="auto" w:val="clear"/>
+            <w:tcMar>
+              <w:top w:type="dxa" w:w="60"/>
+              <w:left w:type="dxa" w:w="100"/>
+              <w:bottom w:type="dxa" w:w="60"/>
+              <w:right w:type="dxa" w:w="100"/>
+            </w:tcMar>
+          </w:tcPr>
+          <w:p>
+            <w:pPr>
+              <w:spacing w:after="20" w:line="252"/>
+            </w:pPr>
+            <w:r>
+              <w:rPr>
+                <w:rFonts w:ascii="Nunito" w:cs="Nunito" w:eastAsia="Nunito" w:hAnsi="Nunito"/>
+                <w:color w:val="1D2433"/>
+                <w:sz w:val="18"/>
+                <w:szCs w:val="18"/>
+              </w:rPr>
+              <w:t xml:space="preserve">—</w:t>
+            </w:r>
+          </w:p>
+        </w:tc>
+        <w:tc>
+          <w:tcPr>
+            <w:tcW w:type="dxa" w:w="1438"/>
+            <w:tcBorders>
+              <w:top w:val="single" w:color="C9D3E3" w:sz="4"/>
+              <w:left w:val="single" w:color="C9D3E3" w:sz="4"/>
+              <w:bottom w:val="single" w:color="C9D3E3" w:sz="4"/>
+              <w:right w:val="single" w:color="C9D3E3" w:sz="4"/>
+            </w:tcBorders>
+            <w:shd w:fill="FFFFFF" w:color="auto" w:val="clear"/>
+            <w:tcMar>
+              <w:top w:type="dxa" w:w="60"/>
+              <w:left w:type="dxa" w:w="100"/>
+              <w:bottom w:type="dxa" w:w="60"/>
+              <w:right w:type="dxa" w:w="100"/>
+            </w:tcMar>
+          </w:tcPr>
+          <w:p>
+            <w:pPr>
+              <w:spacing w:after="20" w:line="252"/>
+            </w:pPr>
+            <w:r>
+              <w:rPr>
+                <w:rFonts w:ascii="Nunito" w:cs="Nunito" w:eastAsia="Nunito" w:hAnsi="Nunito"/>
+                <w:color w:val="1D2433"/>
+                <w:sz w:val="18"/>
+                <w:szCs w:val="18"/>
+              </w:rPr>
+              <w:t xml:space="preserve">170</w:t>
+            </w:r>
+          </w:p>
+        </w:tc>
+      </w:tr>
+      <w:tr>
+        <w:trPr>
+          <w:cantSplit/>
+          <w:tblHeader w:val="off"/>
+        </w:trPr>
+        <w:tc>
+          <w:tcPr>
+            <w:tcW w:type="dxa" w:w="2300"/>
+            <w:tcBorders>
+              <w:top w:val="single" w:color="C9D3E3" w:sz="4"/>
+              <w:left w:val="single" w:color="C9D3E3" w:sz="4"/>
+              <w:bottom w:val="single" w:color="C9D3E3" w:sz="4"/>
+              <w:right w:val="single" w:color="C9D3E3" w:sz="4"/>
+            </w:tcBorders>
+            <w:shd w:fill="E8F1FC" w:color="auto" w:val="clear"/>
+            <w:tcMar>
+              <w:top w:type="dxa" w:w="60"/>
+              <w:left w:type="dxa" w:w="100"/>
+              <w:bottom w:type="dxa" w:w="60"/>
+              <w:right w:type="dxa" w:w="100"/>
+            </w:tcMar>
+          </w:tcPr>
+          <w:p>
+            <w:pPr>
+              <w:spacing w:after="20" w:line="252"/>
+            </w:pPr>
+            <w:r>
+              <w:rPr>
+                <w:rFonts w:ascii="Nunito" w:cs="Nunito" w:eastAsia="Nunito" w:hAnsi="Nunito"/>
+                <w:color w:val="1D2433"/>
+                <w:sz w:val="18"/>
+                <w:szCs w:val="18"/>
+              </w:rPr>
+              <w:t xml:space="preserve">1965 (janv. – mars)</w:t>
+            </w:r>
+          </w:p>
+        </w:tc>
+        <w:tc>
+          <w:tcPr>
+            <w:tcW w:type="dxa" w:w="1500"/>
+            <w:tcBorders>
+              <w:top w:val="single" w:color="C9D3E3" w:sz="4"/>
+              <w:left w:val="single" w:color="C9D3E3" w:sz="4"/>
+              <w:bottom w:val="single" w:color="C9D3E3" w:sz="4"/>
+              <w:right w:val="single" w:color="C9D3E3" w:sz="4"/>
+            </w:tcBorders>
+            <w:shd w:fill="E8F1FC" w:color="auto" w:val="clear"/>
+            <w:tcMar>
+              <w:top w:type="dxa" w:w="60"/>
+              <w:left w:type="dxa" w:w="100"/>
+              <w:bottom w:type="dxa" w:w="60"/>
+              <w:right w:type="dxa" w:w="100"/>
+            </w:tcMar>
+          </w:tcPr>
+          <w:p>
+            <w:pPr>
+              <w:spacing w:after="20" w:line="252"/>
+            </w:pPr>
+            <w:r>
+              <w:rPr>
+                <w:rFonts w:ascii="Nunito" w:cs="Nunito" w:eastAsia="Nunito" w:hAnsi="Nunito"/>
+                <w:color w:val="1D2433"/>
+                <w:sz w:val="18"/>
+                <w:szCs w:val="18"/>
+              </w:rPr>
+              <w:t xml:space="preserve">58 ans</w:t>
+            </w:r>
+          </w:p>
+        </w:tc>
+        <w:tc>
+          <w:tcPr>
+            <w:tcW w:type="dxa" w:w="1400"/>
+            <w:tcBorders>
+              <w:top w:val="single" w:color="C9D3E3" w:sz="4"/>
+              <w:left w:val="single" w:color="C9D3E3" w:sz="4"/>
+              <w:bottom w:val="single" w:color="C9D3E3" w:sz="4"/>
+              <w:right w:val="single" w:color="C9D3E3" w:sz="4"/>
+            </w:tcBorders>
+            <w:shd w:fill="E8F1FC" w:color="auto" w:val="clear"/>
+            <w:tcMar>
+              <w:top w:type="dxa" w:w="60"/>
+              <w:left w:type="dxa" w:w="100"/>
+              <w:bottom w:type="dxa" w:w="60"/>
+              <w:right w:type="dxa" w:w="100"/>
+            </w:tcMar>
+          </w:tcPr>
+          <w:p>
+            <w:pPr>
+              <w:spacing w:after="20" w:line="252"/>
+            </w:pPr>
+            <w:r>
+              <w:rPr>
+                <w:rFonts w:ascii="Nunito" w:cs="Nunito" w:eastAsia="Nunito" w:hAnsi="Nunito"/>
+                <w:color w:val="1D2433"/>
+                <w:sz w:val="18"/>
+                <w:szCs w:val="18"/>
+              </w:rPr>
+              <w:t xml:space="preserve">60 ans</w:t>
+            </w:r>
+          </w:p>
+        </w:tc>
+        <w:tc>
+          <w:tcPr>
+            <w:tcW w:type="dxa" w:w="1700"/>
+            <w:tcBorders>
+              <w:top w:val="single" w:color="C9D3E3" w:sz="4"/>
+              <w:left w:val="single" w:color="C9D3E3" w:sz="4"/>
+              <w:bottom w:val="single" w:color="C9D3E3" w:sz="4"/>
+              <w:right w:val="single" w:color="C9D3E3" w:sz="4"/>
+            </w:tcBorders>
+            <w:shd w:fill="E8F1FC" w:color="auto" w:val="clear"/>
+            <w:tcMar>
+              <w:top w:type="dxa" w:w="60"/>
+              <w:left w:type="dxa" w:w="100"/>
+              <w:bottom w:type="dxa" w:w="60"/>
+              <w:right w:type="dxa" w:w="100"/>
+            </w:tcMar>
+          </w:tcPr>
+          <w:p>
+            <w:pPr>
+              <w:spacing w:after="20" w:line="252"/>
+            </w:pPr>
+            <w:r>
+              <w:rPr>
+                <w:rFonts w:ascii="Nunito" w:cs="Nunito" w:eastAsia="Nunito" w:hAnsi="Nunito"/>
+                <w:color w:val="1D2433"/>
+                <w:sz w:val="18"/>
+                <w:szCs w:val="18"/>
+              </w:rPr>
+              <w:t xml:space="preserve">60 ans 9 mois</w:t>
+            </w:r>
+          </w:p>
+        </w:tc>
+        <w:tc>
+          <w:tcPr>
+            <w:tcW w:type="dxa" w:w="1300"/>
+            <w:tcBorders>
+              <w:top w:val="single" w:color="C9D3E3" w:sz="4"/>
+              <w:left w:val="single" w:color="C9D3E3" w:sz="4"/>
+              <w:bottom w:val="single" w:color="C9D3E3" w:sz="4"/>
+              <w:right w:val="single" w:color="C9D3E3" w:sz="4"/>
+            </w:tcBorders>
+            <w:shd w:fill="E8F1FC" w:color="auto" w:val="clear"/>
+            <w:tcMar>
+              <w:top w:type="dxa" w:w="60"/>
+              <w:left w:type="dxa" w:w="100"/>
+              <w:bottom w:type="dxa" w:w="60"/>
+              <w:right w:type="dxa" w:w="100"/>
+            </w:tcMar>
+          </w:tcPr>
+          <w:p>
+            <w:pPr>
+              <w:spacing w:after="20" w:line="252"/>
+            </w:pPr>
+            <w:r>
+              <w:rPr>
+                <w:rFonts w:ascii="Nunito" w:cs="Nunito" w:eastAsia="Nunito" w:hAnsi="Nunito"/>
+                <w:color w:val="1D2433"/>
+                <w:sz w:val="18"/>
+                <w:szCs w:val="18"/>
+              </w:rPr>
+              <w:t xml:space="preserve">—</w:t>
+            </w:r>
+          </w:p>
+        </w:tc>
+        <w:tc>
+          <w:tcPr>
+            <w:tcW w:type="dxa" w:w="1438"/>
+            <w:tcBorders>
+              <w:top w:val="single" w:color="C9D3E3" w:sz="4"/>
+              <w:left w:val="single" w:color="C9D3E3" w:sz="4"/>
+              <w:bottom w:val="single" w:color="C9D3E3" w:sz="4"/>
+              <w:right w:val="single" w:color="C9D3E3" w:sz="4"/>
+            </w:tcBorders>
+            <w:shd w:fill="E8F1FC" w:color="auto" w:val="clear"/>
+            <w:tcMar>
+              <w:top w:type="dxa" w:w="60"/>
+              <w:left w:type="dxa" w:w="100"/>
+              <w:bottom w:type="dxa" w:w="60"/>
+              <w:right w:type="dxa" w:w="100"/>
+            </w:tcMar>
+          </w:tcPr>
+          <w:p>
+            <w:pPr>
+              <w:spacing w:after="20" w:line="252"/>
+            </w:pPr>
+            <w:r>
+              <w:rPr>
+                <w:rFonts w:ascii="Nunito" w:cs="Nunito" w:eastAsia="Nunito" w:hAnsi="Nunito"/>
+                <w:color w:val="1D2433"/>
+                <w:sz w:val="18"/>
+                <w:szCs w:val="18"/>
+              </w:rPr>
+              <w:t xml:space="preserve">170</w:t>
+            </w:r>
+          </w:p>
+        </w:tc>
+      </w:tr>
+      <w:tr>
+        <w:trPr>
+          <w:cantSplit/>
+          <w:tblHeader w:val="off"/>
+        </w:trPr>
+        <w:tc>
+          <w:tcPr>
+            <w:tcW w:type="dxa" w:w="2300"/>
+            <w:tcBorders>
+              <w:top w:val="single" w:color="C9D3E3" w:sz="4"/>
+              <w:left w:val="single" w:color="C9D3E3" w:sz="4"/>
+              <w:bottom w:val="single" w:color="C9D3E3" w:sz="4"/>
+              <w:right w:val="single" w:color="C9D3E3" w:sz="4"/>
+            </w:tcBorders>
+            <w:shd w:fill="FFFFFF" w:color="auto" w:val="clear"/>
+            <w:tcMar>
+              <w:top w:type="dxa" w:w="60"/>
+              <w:left w:type="dxa" w:w="100"/>
+              <w:bottom w:type="dxa" w:w="60"/>
+              <w:right w:type="dxa" w:w="100"/>
+            </w:tcMar>
+          </w:tcPr>
+          <w:p>
+            <w:pPr>
+              <w:spacing w:after="20" w:line="252"/>
+            </w:pPr>
+            <w:r>
+              <w:rPr>
+                <w:rFonts w:ascii="Nunito" w:cs="Nunito" w:eastAsia="Nunito" w:hAnsi="Nunito"/>
+                <w:color w:val="1D2433"/>
+                <w:sz w:val="18"/>
+                <w:szCs w:val="18"/>
+              </w:rPr>
+              <w:t xml:space="preserve">1965 (avril – nov.)</w:t>
+            </w:r>
+          </w:p>
+        </w:tc>
+        <w:tc>
+          <w:tcPr>
+            <w:tcW w:type="dxa" w:w="1500"/>
+            <w:tcBorders>
+              <w:top w:val="single" w:color="C9D3E3" w:sz="4"/>
+              <w:left w:val="single" w:color="C9D3E3" w:sz="4"/>
+              <w:bottom w:val="single" w:color="C9D3E3" w:sz="4"/>
+              <w:right w:val="single" w:color="C9D3E3" w:sz="4"/>
+            </w:tcBorders>
+            <w:shd w:fill="FFFFFF" w:color="auto" w:val="clear"/>
+            <w:tcMar>
+              <w:top w:type="dxa" w:w="60"/>
+              <w:left w:type="dxa" w:w="100"/>
+              <w:bottom w:type="dxa" w:w="60"/>
+              <w:right w:type="dxa" w:w="100"/>
+            </w:tcMar>
+          </w:tcPr>
+          <w:p>
+            <w:pPr>
+              <w:spacing w:after="20" w:line="252"/>
+            </w:pPr>
+            <w:r>
+              <w:rPr>
+                <w:rFonts w:ascii="Nunito" w:cs="Nunito" w:eastAsia="Nunito" w:hAnsi="Nunito"/>
+                <w:color w:val="1D2433"/>
+                <w:sz w:val="18"/>
+                <w:szCs w:val="18"/>
+              </w:rPr>
+              <w:t xml:space="preserve">58 ans</w:t>
+            </w:r>
+          </w:p>
+        </w:tc>
+        <w:tc>
+          <w:tcPr>
+            <w:tcW w:type="dxa" w:w="1400"/>
+            <w:tcBorders>
+              <w:top w:val="single" w:color="C9D3E3" w:sz="4"/>
+              <w:left w:val="single" w:color="C9D3E3" w:sz="4"/>
+              <w:bottom w:val="single" w:color="C9D3E3" w:sz="4"/>
+              <w:right w:val="single" w:color="C9D3E3" w:sz="4"/>
+            </w:tcBorders>
+            <w:shd w:fill="FFFFFF" w:color="auto" w:val="clear"/>
+            <w:tcMar>
+              <w:top w:type="dxa" w:w="60"/>
+              <w:left w:type="dxa" w:w="100"/>
+              <w:bottom w:type="dxa" w:w="60"/>
+              <w:right w:type="dxa" w:w="100"/>
+            </w:tcMar>
+          </w:tcPr>
+          <w:p>
+            <w:pPr>
+              <w:spacing w:after="20" w:line="252"/>
+            </w:pPr>
+            <w:r>
+              <w:rPr>
+                <w:rFonts w:ascii="Nunito" w:cs="Nunito" w:eastAsia="Nunito" w:hAnsi="Nunito"/>
+                <w:color w:val="1D2433"/>
+                <w:sz w:val="18"/>
+                <w:szCs w:val="18"/>
+              </w:rPr>
+              <w:t xml:space="preserve">60 ans</w:t>
+            </w:r>
+          </w:p>
+        </w:tc>
+        <w:tc>
+          <w:tcPr>
+            <w:tcW w:type="dxa" w:w="1700"/>
+            <w:tcBorders>
+              <w:top w:val="single" w:color="C9D3E3" w:sz="4"/>
+              <w:left w:val="single" w:color="C9D3E3" w:sz="4"/>
+              <w:bottom w:val="single" w:color="C9D3E3" w:sz="4"/>
+              <w:right w:val="single" w:color="C9D3E3" w:sz="4"/>
+            </w:tcBorders>
+            <w:shd w:fill="FFFFFF" w:color="auto" w:val="clear"/>
+            <w:tcMar>
+              <w:top w:type="dxa" w:w="60"/>
+              <w:left w:type="dxa" w:w="100"/>
+              <w:bottom w:type="dxa" w:w="60"/>
+              <w:right w:type="dxa" w:w="100"/>
+            </w:tcMar>
+          </w:tcPr>
+          <w:p>
+            <w:pPr>
+              <w:spacing w:after="20" w:line="252"/>
+            </w:pPr>
+            <w:r>
+              <w:rPr>
+                <w:rFonts w:ascii="Nunito" w:cs="Nunito" w:eastAsia="Nunito" w:hAnsi="Nunito"/>
+                <w:color w:val="1D2433"/>
+                <w:sz w:val="18"/>
+                <w:szCs w:val="18"/>
+              </w:rPr>
+              <w:t xml:space="preserve">60 ans 9 mois</w:t>
+            </w:r>
+          </w:p>
+        </w:tc>
+        <w:tc>
+          <w:tcPr>
+            <w:tcW w:type="dxa" w:w="1300"/>
+            <w:tcBorders>
+              <w:top w:val="single" w:color="C9D3E3" w:sz="4"/>
+              <w:left w:val="single" w:color="C9D3E3" w:sz="4"/>
+              <w:bottom w:val="single" w:color="C9D3E3" w:sz="4"/>
+              <w:right w:val="single" w:color="C9D3E3" w:sz="4"/>
+            </w:tcBorders>
+            <w:shd w:fill="FFFFFF" w:color="auto" w:val="clear"/>
+            <w:tcMar>
+              <w:top w:type="dxa" w:w="60"/>
+              <w:left w:type="dxa" w:w="100"/>
+              <w:bottom w:type="dxa" w:w="60"/>
+              <w:right w:type="dxa" w:w="100"/>
+            </w:tcMar>
+          </w:tcPr>
+          <w:p>
+            <w:pPr>
+              <w:spacing w:after="20" w:line="252"/>
+            </w:pPr>
+            <w:r>
+              <w:rPr>
+                <w:rFonts w:ascii="Nunito" w:cs="Nunito" w:eastAsia="Nunito" w:hAnsi="Nunito"/>
+                <w:color w:val="1D2433"/>
+                <w:sz w:val="18"/>
+                <w:szCs w:val="18"/>
+              </w:rPr>
+              <w:t xml:space="preserve">—</w:t>
+            </w:r>
+          </w:p>
+        </w:tc>
+        <w:tc>
+          <w:tcPr>
+            <w:tcW w:type="dxa" w:w="1438"/>
+            <w:tcBorders>
+              <w:top w:val="single" w:color="C9D3E3" w:sz="4"/>
+              <w:left w:val="single" w:color="C9D3E3" w:sz="4"/>
+              <w:bottom w:val="single" w:color="C9D3E3" w:sz="4"/>
+              <w:right w:val="single" w:color="C9D3E3" w:sz="4"/>
+            </w:tcBorders>
+            <w:shd w:fill="FFFFFF" w:color="auto" w:val="clear"/>
+            <w:tcMar>
+              <w:top w:type="dxa" w:w="60"/>
+              <w:left w:type="dxa" w:w="100"/>
+              <w:bottom w:type="dxa" w:w="60"/>
+              <w:right w:type="dxa" w:w="100"/>
+            </w:tcMar>
+          </w:tcPr>
+          <w:p>
+            <w:pPr>
+              <w:spacing w:after="20" w:line="252"/>
+            </w:pPr>
+            <w:r>
+              <w:rPr>
+                <w:rFonts w:ascii="Nunito" w:cs="Nunito" w:eastAsia="Nunito" w:hAnsi="Nunito"/>
+                <w:color w:val="1D2433"/>
+                <w:sz w:val="18"/>
+                <w:szCs w:val="18"/>
+              </w:rPr>
+              <w:t xml:space="preserve">171</w:t>
+            </w:r>
+          </w:p>
+        </w:tc>
+      </w:tr>
+      <w:tr>
+        <w:trPr>
+          <w:cantSplit/>
+          <w:tblHeader w:val="off"/>
+        </w:trPr>
+        <w:tc>
+          <w:tcPr>
+            <w:tcW w:type="dxa" w:w="2300"/>
+            <w:tcBorders>
+              <w:top w:val="single" w:color="C9D3E3" w:sz="4"/>
+              <w:left w:val="single" w:color="C9D3E3" w:sz="4"/>
+              <w:bottom w:val="single" w:color="C9D3E3" w:sz="4"/>
+              <w:right w:val="single" w:color="C9D3E3" w:sz="4"/>
+            </w:tcBorders>
+            <w:shd w:fill="E8F1FC" w:color="auto" w:val="clear"/>
+            <w:tcMar>
+              <w:top w:type="dxa" w:w="60"/>
+              <w:left w:type="dxa" w:w="100"/>
+              <w:bottom w:type="dxa" w:w="60"/>
+              <w:right w:type="dxa" w:w="100"/>
+            </w:tcMar>
+          </w:tcPr>
+          <w:p>
+            <w:pPr>
+              <w:spacing w:after="20" w:line="252"/>
+            </w:pPr>
+            <w:r>
+              <w:rPr>
+                <w:rFonts w:ascii="Nunito" w:cs="Nunito" w:eastAsia="Nunito" w:hAnsi="Nunito"/>
+                <w:color w:val="1D2433"/>
+                <w:sz w:val="18"/>
+                <w:szCs w:val="18"/>
+              </w:rPr>
+              <w:t xml:space="preserve">1965 (déc.)</w:t>
+            </w:r>
+          </w:p>
+        </w:tc>
+        <w:tc>
+          <w:tcPr>
+            <w:tcW w:type="dxa" w:w="1500"/>
+            <w:tcBorders>
+              <w:top w:val="single" w:color="C9D3E3" w:sz="4"/>
+              <w:left w:val="single" w:color="C9D3E3" w:sz="4"/>
+              <w:bottom w:val="single" w:color="C9D3E3" w:sz="4"/>
+              <w:right w:val="single" w:color="C9D3E3" w:sz="4"/>
+            </w:tcBorders>
+            <w:shd w:fill="E8F1FC" w:color="auto" w:val="clear"/>
+            <w:tcMar>
+              <w:top w:type="dxa" w:w="60"/>
+              <w:left w:type="dxa" w:w="100"/>
+              <w:bottom w:type="dxa" w:w="60"/>
+              <w:right w:type="dxa" w:w="100"/>
+            </w:tcMar>
+          </w:tcPr>
+          <w:p>
+            <w:pPr>
+              <w:spacing w:after="20" w:line="252"/>
+            </w:pPr>
+            <w:r>
+              <w:rPr>
+                <w:rFonts w:ascii="Nunito" w:cs="Nunito" w:eastAsia="Nunito" w:hAnsi="Nunito"/>
+                <w:color w:val="1D2433"/>
+                <w:sz w:val="18"/>
+                <w:szCs w:val="18"/>
+              </w:rPr>
+              <w:t xml:space="preserve">58 ans</w:t>
+            </w:r>
+          </w:p>
+        </w:tc>
+        <w:tc>
+          <w:tcPr>
+            <w:tcW w:type="dxa" w:w="1400"/>
+            <w:tcBorders>
+              <w:top w:val="single" w:color="C9D3E3" w:sz="4"/>
+              <w:left w:val="single" w:color="C9D3E3" w:sz="4"/>
+              <w:bottom w:val="single" w:color="C9D3E3" w:sz="4"/>
+              <w:right w:val="single" w:color="C9D3E3" w:sz="4"/>
+            </w:tcBorders>
+            <w:shd w:fill="E8F1FC" w:color="auto" w:val="clear"/>
+            <w:tcMar>
+              <w:top w:type="dxa" w:w="60"/>
+              <w:left w:type="dxa" w:w="100"/>
+              <w:bottom w:type="dxa" w:w="60"/>
+              <w:right w:type="dxa" w:w="100"/>
+            </w:tcMar>
+          </w:tcPr>
+          <w:p>
+            <w:pPr>
+              <w:spacing w:after="20" w:line="252"/>
+            </w:pPr>
+            <w:r>
+              <w:rPr>
+                <w:rFonts w:ascii="Nunito" w:cs="Nunito" w:eastAsia="Nunito" w:hAnsi="Nunito"/>
+                <w:color w:val="1D2433"/>
+                <w:sz w:val="18"/>
+                <w:szCs w:val="18"/>
+              </w:rPr>
+              <w:t xml:space="preserve">60 ans</w:t>
+            </w:r>
+          </w:p>
+        </w:tc>
+        <w:tc>
+          <w:tcPr>
+            <w:tcW w:type="dxa" w:w="1700"/>
+            <w:tcBorders>
+              <w:top w:val="single" w:color="C9D3E3" w:sz="4"/>
+              <w:left w:val="single" w:color="C9D3E3" w:sz="4"/>
+              <w:bottom w:val="single" w:color="C9D3E3" w:sz="4"/>
+              <w:right w:val="single" w:color="C9D3E3" w:sz="4"/>
+            </w:tcBorders>
+            <w:shd w:fill="E8F1FC" w:color="auto" w:val="clear"/>
+            <w:tcMar>
+              <w:top w:type="dxa" w:w="60"/>
+              <w:left w:type="dxa" w:w="100"/>
+              <w:bottom w:type="dxa" w:w="60"/>
+              <w:right w:type="dxa" w:w="100"/>
+            </w:tcMar>
+          </w:tcPr>
+          <w:p>
+            <w:pPr>
+              <w:spacing w:after="20" w:line="252"/>
+            </w:pPr>
+            <w:r>
+              <w:rPr>
+                <w:rFonts w:ascii="Nunito" w:cs="Nunito" w:eastAsia="Nunito" w:hAnsi="Nunito"/>
+                <w:color w:val="1D2433"/>
+                <w:sz w:val="18"/>
+                <w:szCs w:val="18"/>
+              </w:rPr>
+              <w:t xml:space="preserve">60 ans 8 mois</w:t>
+            </w:r>
+          </w:p>
+        </w:tc>
+        <w:tc>
+          <w:tcPr>
+            <w:tcW w:type="dxa" w:w="1300"/>
+            <w:tcBorders>
+              <w:top w:val="single" w:color="C9D3E3" w:sz="4"/>
+              <w:left w:val="single" w:color="C9D3E3" w:sz="4"/>
+              <w:bottom w:val="single" w:color="C9D3E3" w:sz="4"/>
+              <w:right w:val="single" w:color="C9D3E3" w:sz="4"/>
+            </w:tcBorders>
+            <w:shd w:fill="E8F1FC" w:color="auto" w:val="clear"/>
+            <w:tcMar>
+              <w:top w:type="dxa" w:w="60"/>
+              <w:left w:type="dxa" w:w="100"/>
+              <w:bottom w:type="dxa" w:w="60"/>
+              <w:right w:type="dxa" w:w="100"/>
+            </w:tcMar>
+          </w:tcPr>
+          <w:p>
+            <w:pPr>
+              <w:spacing w:after="20" w:line="252"/>
+            </w:pPr>
+            <w:r>
+              <w:rPr>
+                <w:rFonts w:ascii="Nunito" w:cs="Nunito" w:eastAsia="Nunito" w:hAnsi="Nunito"/>
+                <w:color w:val="1D2433"/>
+                <w:sz w:val="18"/>
+                <w:szCs w:val="18"/>
+              </w:rPr>
+              <w:t xml:space="preserve">—</w:t>
+            </w:r>
+          </w:p>
+        </w:tc>
+        <w:tc>
+          <w:tcPr>
+            <w:tcW w:type="dxa" w:w="1438"/>
+            <w:tcBorders>
+              <w:top w:val="single" w:color="C9D3E3" w:sz="4"/>
+              <w:left w:val="single" w:color="C9D3E3" w:sz="4"/>
+              <w:bottom w:val="single" w:color="C9D3E3" w:sz="4"/>
+              <w:right w:val="single" w:color="C9D3E3" w:sz="4"/>
+            </w:tcBorders>
+            <w:shd w:fill="E8F1FC" w:color="auto" w:val="clear"/>
+            <w:tcMar>
+              <w:top w:type="dxa" w:w="60"/>
+              <w:left w:type="dxa" w:w="100"/>
+              <w:bottom w:type="dxa" w:w="60"/>
+              <w:right w:type="dxa" w:w="100"/>
+            </w:tcMar>
+          </w:tcPr>
+          <w:p>
+            <w:pPr>
+              <w:spacing w:after="20" w:line="252"/>
+            </w:pPr>
+            <w:r>
+              <w:rPr>
+                <w:rFonts w:ascii="Nunito" w:cs="Nunito" w:eastAsia="Nunito" w:hAnsi="Nunito"/>
+                <w:color w:val="1D2433"/>
+                <w:sz w:val="18"/>
+                <w:szCs w:val="18"/>
+              </w:rPr>
+              <w:t xml:space="preserve">171</w:t>
+            </w:r>
+          </w:p>
+        </w:tc>
+      </w:tr>
+      <w:tr>
+        <w:trPr>
+          <w:cantSplit/>
+          <w:tblHeader w:val="off"/>
+        </w:trPr>
+        <w:tc>
+          <w:tcPr>
+            <w:tcW w:type="dxa" w:w="2300"/>
+            <w:tcBorders>
+              <w:top w:val="single" w:color="C9D3E3" w:sz="4"/>
+              <w:left w:val="single" w:color="C9D3E3" w:sz="4"/>
+              <w:bottom w:val="single" w:color="C9D3E3" w:sz="4"/>
+              <w:right w:val="single" w:color="C9D3E3" w:sz="4"/>
+            </w:tcBorders>
+            <w:shd w:fill="FFFFFF" w:color="auto" w:val="clear"/>
+            <w:tcMar>
+              <w:top w:type="dxa" w:w="60"/>
+              <w:left w:type="dxa" w:w="100"/>
+              <w:bottom w:type="dxa" w:w="60"/>
+              <w:right w:type="dxa" w:w="100"/>
+            </w:tcMar>
+          </w:tcPr>
+          <w:p>
+            <w:pPr>
+              <w:spacing w:after="20" w:line="252"/>
+            </w:pPr>
+            <w:r>
+              <w:rPr>
+                <w:rFonts w:ascii="Nunito" w:cs="Nunito" w:eastAsia="Nunito" w:hAnsi="Nunito"/>
+                <w:color w:val="1D2433"/>
+                <w:sz w:val="18"/>
+                <w:szCs w:val="18"/>
+              </w:rPr>
+              <w:t xml:space="preserve">1966</w:t>
+            </w:r>
+          </w:p>
+        </w:tc>
+        <w:tc>
+          <w:tcPr>
+            <w:tcW w:type="dxa" w:w="1500"/>
+            <w:tcBorders>
+              <w:top w:val="single" w:color="C9D3E3" w:sz="4"/>
+              <w:left w:val="single" w:color="C9D3E3" w:sz="4"/>
+              <w:bottom w:val="single" w:color="C9D3E3" w:sz="4"/>
+              <w:right w:val="single" w:color="C9D3E3" w:sz="4"/>
+            </w:tcBorders>
+            <w:shd w:fill="FFFFFF" w:color="auto" w:val="clear"/>
+            <w:tcMar>
+              <w:top w:type="dxa" w:w="60"/>
+              <w:left w:type="dxa" w:w="100"/>
+              <w:bottom w:type="dxa" w:w="60"/>
+              <w:right w:type="dxa" w:w="100"/>
+            </w:tcMar>
+          </w:tcPr>
+          <w:p>
+            <w:pPr>
+              <w:spacing w:after="20" w:line="252"/>
+            </w:pPr>
+            <w:r>
+              <w:rPr>
+                <w:rFonts w:ascii="Nunito" w:cs="Nunito" w:eastAsia="Nunito" w:hAnsi="Nunito"/>
+                <w:color w:val="1D2433"/>
+                <w:sz w:val="18"/>
+                <w:szCs w:val="18"/>
+              </w:rPr>
+              <w:t xml:space="preserve">58 ans</w:t>
+            </w:r>
+          </w:p>
+        </w:tc>
+        <w:tc>
+          <w:tcPr>
+            <w:tcW w:type="dxa" w:w="1400"/>
+            <w:tcBorders>
+              <w:top w:val="single" w:color="C9D3E3" w:sz="4"/>
+              <w:left w:val="single" w:color="C9D3E3" w:sz="4"/>
+              <w:bottom w:val="single" w:color="C9D3E3" w:sz="4"/>
+              <w:right w:val="single" w:color="C9D3E3" w:sz="4"/>
+            </w:tcBorders>
+            <w:shd w:fill="FFFFFF" w:color="auto" w:val="clear"/>
+            <w:tcMar>
+              <w:top w:type="dxa" w:w="60"/>
+              <w:left w:type="dxa" w:w="100"/>
+              <w:bottom w:type="dxa" w:w="60"/>
+              <w:right w:type="dxa" w:w="100"/>
+            </w:tcMar>
+          </w:tcPr>
+          <w:p>
+            <w:pPr>
+              <w:spacing w:after="20" w:line="252"/>
+            </w:pPr>
+            <w:r>
+              <w:rPr>
+                <w:rFonts w:ascii="Nunito" w:cs="Nunito" w:eastAsia="Nunito" w:hAnsi="Nunito"/>
+                <w:color w:val="1D2433"/>
+                <w:sz w:val="18"/>
+                <w:szCs w:val="18"/>
+              </w:rPr>
+              <w:t xml:space="preserve">60 ans</w:t>
+            </w:r>
+          </w:p>
+        </w:tc>
+        <w:tc>
+          <w:tcPr>
+            <w:tcW w:type="dxa" w:w="1700"/>
+            <w:tcBorders>
+              <w:top w:val="single" w:color="C9D3E3" w:sz="4"/>
+              <w:left w:val="single" w:color="C9D3E3" w:sz="4"/>
+              <w:bottom w:val="single" w:color="C9D3E3" w:sz="4"/>
+              <w:right w:val="single" w:color="C9D3E3" w:sz="4"/>
+            </w:tcBorders>
+            <w:shd w:fill="FFFFFF" w:color="auto" w:val="clear"/>
+            <w:tcMar>
+              <w:top w:type="dxa" w:w="60"/>
+              <w:left w:type="dxa" w:w="100"/>
+              <w:bottom w:type="dxa" w:w="60"/>
+              <w:right w:type="dxa" w:w="100"/>
+            </w:tcMar>
+          </w:tcPr>
+          <w:p>
+            <w:pPr>
+              <w:spacing w:after="20" w:line="252"/>
+            </w:pPr>
+            <w:r>
+              <w:rPr>
+                <w:rFonts w:ascii="Nunito" w:cs="Nunito" w:eastAsia="Nunito" w:hAnsi="Nunito"/>
+                <w:color w:val="1D2433"/>
+                <w:sz w:val="18"/>
+                <w:szCs w:val="18"/>
+              </w:rPr>
+              <w:t xml:space="preserve">60 ans 9 mois</w:t>
+            </w:r>
+          </w:p>
+        </w:tc>
+        <w:tc>
+          <w:tcPr>
+            <w:tcW w:type="dxa" w:w="1300"/>
+            <w:tcBorders>
+              <w:top w:val="single" w:color="C9D3E3" w:sz="4"/>
+              <w:left w:val="single" w:color="C9D3E3" w:sz="4"/>
+              <w:bottom w:val="single" w:color="C9D3E3" w:sz="4"/>
+              <w:right w:val="single" w:color="C9D3E3" w:sz="4"/>
+            </w:tcBorders>
+            <w:shd w:fill="FFFFFF" w:color="auto" w:val="clear"/>
+            <w:tcMar>
+              <w:top w:type="dxa" w:w="60"/>
+              <w:left w:type="dxa" w:w="100"/>
+              <w:bottom w:type="dxa" w:w="60"/>
+              <w:right w:type="dxa" w:w="100"/>
+            </w:tcMar>
+          </w:tcPr>
+          <w:p>
+            <w:pPr>
+              <w:spacing w:after="20" w:line="252"/>
+            </w:pPr>
+            <w:r>
+              <w:rPr>
+                <w:rFonts w:ascii="Nunito" w:cs="Nunito" w:eastAsia="Nunito" w:hAnsi="Nunito"/>
+                <w:color w:val="1D2433"/>
+                <w:sz w:val="18"/>
+                <w:szCs w:val="18"/>
+              </w:rPr>
+              <w:t xml:space="preserve">63 ans</w:t>
+            </w:r>
+          </w:p>
+        </w:tc>
+        <w:tc>
+          <w:tcPr>
+            <w:tcW w:type="dxa" w:w="1438"/>
+            <w:tcBorders>
+              <w:top w:val="single" w:color="C9D3E3" w:sz="4"/>
+              <w:left w:val="single" w:color="C9D3E3" w:sz="4"/>
+              <w:bottom w:val="single" w:color="C9D3E3" w:sz="4"/>
+              <w:right w:val="single" w:color="C9D3E3" w:sz="4"/>
+            </w:tcBorders>
+            <w:shd w:fill="FFFFFF" w:color="auto" w:val="clear"/>
+            <w:tcMar>
+              <w:top w:type="dxa" w:w="60"/>
+              <w:left w:type="dxa" w:w="100"/>
+              <w:bottom w:type="dxa" w:w="60"/>
+              <w:right w:type="dxa" w:w="100"/>
+            </w:tcMar>
+          </w:tcPr>
+          <w:p>
+            <w:pPr>
+              <w:spacing w:after="20" w:line="252"/>
+            </w:pPr>
+            <w:r>
+              <w:rPr>
+                <w:rFonts w:ascii="Nunito" w:cs="Nunito" w:eastAsia="Nunito" w:hAnsi="Nunito"/>
+                <w:color w:val="1D2433"/>
+                <w:sz w:val="18"/>
+                <w:szCs w:val="18"/>
+              </w:rPr>
+              <w:t xml:space="preserve">172</w:t>
+            </w:r>
+          </w:p>
+        </w:tc>
+      </w:tr>
+      <w:tr>
+        <w:trPr>
+          <w:cantSplit/>
+          <w:tblHeader w:val="off"/>
+        </w:trPr>
+        <w:tc>
+          <w:tcPr>
+            <w:tcW w:type="dxa" w:w="2300"/>
+            <w:tcBorders>
+              <w:top w:val="single" w:color="C9D3E3" w:sz="4"/>
+              <w:left w:val="single" w:color="C9D3E3" w:sz="4"/>
+              <w:bottom w:val="single" w:color="C9D3E3" w:sz="4"/>
+              <w:right w:val="single" w:color="C9D3E3" w:sz="4"/>
+            </w:tcBorders>
+            <w:shd w:fill="E8F1FC" w:color="auto" w:val="clear"/>
+            <w:tcMar>
+              <w:top w:type="dxa" w:w="60"/>
+              <w:left w:type="dxa" w:w="100"/>
+              <w:bottom w:type="dxa" w:w="60"/>
+              <w:right w:type="dxa" w:w="100"/>
+            </w:tcMar>
+          </w:tcPr>
+          <w:p>
+            <w:pPr>
+              <w:spacing w:after="20" w:line="252"/>
+            </w:pPr>
+            <w:r>
+              <w:rPr>
+                <w:rFonts w:ascii="Nunito" w:cs="Nunito" w:eastAsia="Nunito" w:hAnsi="Nunito"/>
+                <w:color w:val="1D2433"/>
+                <w:sz w:val="18"/>
+                <w:szCs w:val="18"/>
+              </w:rPr>
+              <w:t xml:space="preserve">1967</w:t>
+            </w:r>
+          </w:p>
+        </w:tc>
+        <w:tc>
+          <w:tcPr>
+            <w:tcW w:type="dxa" w:w="1500"/>
+            <w:tcBorders>
+              <w:top w:val="single" w:color="C9D3E3" w:sz="4"/>
+              <w:left w:val="single" w:color="C9D3E3" w:sz="4"/>
+              <w:bottom w:val="single" w:color="C9D3E3" w:sz="4"/>
+              <w:right w:val="single" w:color="C9D3E3" w:sz="4"/>
+            </w:tcBorders>
+            <w:shd w:fill="E8F1FC" w:color="auto" w:val="clear"/>
+            <w:tcMar>
+              <w:top w:type="dxa" w:w="60"/>
+              <w:left w:type="dxa" w:w="100"/>
+              <w:bottom w:type="dxa" w:w="60"/>
+              <w:right w:type="dxa" w:w="100"/>
+            </w:tcMar>
+          </w:tcPr>
+          <w:p>
+            <w:pPr>
+              <w:spacing w:after="20" w:line="252"/>
+            </w:pPr>
+            <w:r>
+              <w:rPr>
+                <w:rFonts w:ascii="Nunito" w:cs="Nunito" w:eastAsia="Nunito" w:hAnsi="Nunito"/>
+                <w:color w:val="1D2433"/>
+                <w:sz w:val="18"/>
+                <w:szCs w:val="18"/>
+              </w:rPr>
+              <w:t xml:space="preserve">58 ans</w:t>
+            </w:r>
+          </w:p>
+        </w:tc>
+        <w:tc>
+          <w:tcPr>
+            <w:tcW w:type="dxa" w:w="1400"/>
+            <w:tcBorders>
+              <w:top w:val="single" w:color="C9D3E3" w:sz="4"/>
+              <w:left w:val="single" w:color="C9D3E3" w:sz="4"/>
+              <w:bottom w:val="single" w:color="C9D3E3" w:sz="4"/>
+              <w:right w:val="single" w:color="C9D3E3" w:sz="4"/>
+            </w:tcBorders>
+            <w:shd w:fill="E8F1FC" w:color="auto" w:val="clear"/>
+            <w:tcMar>
+              <w:top w:type="dxa" w:w="60"/>
+              <w:left w:type="dxa" w:w="100"/>
+              <w:bottom w:type="dxa" w:w="60"/>
+              <w:right w:type="dxa" w:w="100"/>
+            </w:tcMar>
+          </w:tcPr>
+          <w:p>
+            <w:pPr>
+              <w:spacing w:after="20" w:line="252"/>
+            </w:pPr>
+            <w:r>
+              <w:rPr>
+                <w:rFonts w:ascii="Nunito" w:cs="Nunito" w:eastAsia="Nunito" w:hAnsi="Nunito"/>
+                <w:color w:val="1D2433"/>
+                <w:sz w:val="18"/>
+                <w:szCs w:val="18"/>
+              </w:rPr>
+              <w:t xml:space="preserve">60 ans</w:t>
+            </w:r>
+          </w:p>
+        </w:tc>
+        <w:tc>
+          <w:tcPr>
+            <w:tcW w:type="dxa" w:w="1700"/>
+            <w:tcBorders>
+              <w:top w:val="single" w:color="C9D3E3" w:sz="4"/>
+              <w:left w:val="single" w:color="C9D3E3" w:sz="4"/>
+              <w:bottom w:val="single" w:color="C9D3E3" w:sz="4"/>
+              <w:right w:val="single" w:color="C9D3E3" w:sz="4"/>
+            </w:tcBorders>
+            <w:shd w:fill="E8F1FC" w:color="auto" w:val="clear"/>
+            <w:tcMar>
+              <w:top w:type="dxa" w:w="60"/>
+              <w:left w:type="dxa" w:w="100"/>
+              <w:bottom w:type="dxa" w:w="60"/>
+              <w:right w:type="dxa" w:w="100"/>
+            </w:tcMar>
+          </w:tcPr>
+          <w:p>
+            <w:pPr>
+              <w:spacing w:after="20" w:line="252"/>
+            </w:pPr>
+            <w:r>
+              <w:rPr>
+                <w:rFonts w:ascii="Nunito" w:cs="Nunito" w:eastAsia="Nunito" w:hAnsi="Nunito"/>
+                <w:color w:val="1D2433"/>
+                <w:sz w:val="18"/>
+                <w:szCs w:val="18"/>
+              </w:rPr>
+              <w:t xml:space="preserve">61 ans</w:t>
+            </w:r>
+          </w:p>
+        </w:tc>
+        <w:tc>
+          <w:tcPr>
+            <w:tcW w:type="dxa" w:w="1300"/>
+            <w:tcBorders>
+              <w:top w:val="single" w:color="C9D3E3" w:sz="4"/>
+              <w:left w:val="single" w:color="C9D3E3" w:sz="4"/>
+              <w:bottom w:val="single" w:color="C9D3E3" w:sz="4"/>
+              <w:right w:val="single" w:color="C9D3E3" w:sz="4"/>
+            </w:tcBorders>
+            <w:shd w:fill="E8F1FC" w:color="auto" w:val="clear"/>
+            <w:tcMar>
+              <w:top w:type="dxa" w:w="60"/>
+              <w:left w:type="dxa" w:w="100"/>
+              <w:bottom w:type="dxa" w:w="60"/>
+              <w:right w:type="dxa" w:w="100"/>
+            </w:tcMar>
+          </w:tcPr>
+          <w:p>
+            <w:pPr>
+              <w:spacing w:after="20" w:line="252"/>
+            </w:pPr>
+            <w:r>
+              <w:rPr>
+                <w:rFonts w:ascii="Nunito" w:cs="Nunito" w:eastAsia="Nunito" w:hAnsi="Nunito"/>
+                <w:color w:val="1D2433"/>
+                <w:sz w:val="18"/>
+                <w:szCs w:val="18"/>
+              </w:rPr>
+              <w:t xml:space="preserve">63 ans</w:t>
+            </w:r>
+          </w:p>
+        </w:tc>
+        <w:tc>
+          <w:tcPr>
+            <w:tcW w:type="dxa" w:w="1438"/>
+            <w:tcBorders>
+              <w:top w:val="single" w:color="C9D3E3" w:sz="4"/>
+              <w:left w:val="single" w:color="C9D3E3" w:sz="4"/>
+              <w:bottom w:val="single" w:color="C9D3E3" w:sz="4"/>
+              <w:right w:val="single" w:color="C9D3E3" w:sz="4"/>
+            </w:tcBorders>
+            <w:shd w:fill="E8F1FC" w:color="auto" w:val="clear"/>
+            <w:tcMar>
+              <w:top w:type="dxa" w:w="60"/>
+              <w:left w:type="dxa" w:w="100"/>
+              <w:bottom w:type="dxa" w:w="60"/>
+              <w:right w:type="dxa" w:w="100"/>
+            </w:tcMar>
+          </w:tcPr>
+          <w:p>
+            <w:pPr>
+              <w:spacing w:after="20" w:line="252"/>
+            </w:pPr>
+            <w:r>
+              <w:rPr>
+                <w:rFonts w:ascii="Nunito" w:cs="Nunito" w:eastAsia="Nunito" w:hAnsi="Nunito"/>
+                <w:color w:val="1D2433"/>
+                <w:sz w:val="18"/>
+                <w:szCs w:val="18"/>
+              </w:rPr>
+              <w:t xml:space="preserve">172</w:t>
+            </w:r>
+          </w:p>
+        </w:tc>
+      </w:tr>
+      <w:tr>
+        <w:trPr>
+          <w:cantSplit/>
+          <w:tblHeader w:val="off"/>
+        </w:trPr>
+        <w:tc>
+          <w:tcPr>
+            <w:tcW w:type="dxa" w:w="2300"/>
+            <w:tcBorders>
+              <w:top w:val="single" w:color="C9D3E3" w:sz="4"/>
+              <w:left w:val="single" w:color="C9D3E3" w:sz="4"/>
+              <w:bottom w:val="single" w:color="C9D3E3" w:sz="4"/>
+              <w:right w:val="single" w:color="C9D3E3" w:sz="4"/>
+            </w:tcBorders>
+            <w:shd w:fill="FFFFFF" w:color="auto" w:val="clear"/>
+            <w:tcMar>
+              <w:top w:type="dxa" w:w="60"/>
+              <w:left w:type="dxa" w:w="100"/>
+              <w:bottom w:type="dxa" w:w="60"/>
+              <w:right w:type="dxa" w:w="100"/>
+            </w:tcMar>
+          </w:tcPr>
+          <w:p>
+            <w:pPr>
+              <w:spacing w:after="20" w:line="252"/>
+            </w:pPr>
+            <w:r>
+              <w:rPr>
+                <w:rFonts w:ascii="Nunito" w:cs="Nunito" w:eastAsia="Nunito" w:hAnsi="Nunito"/>
+                <w:color w:val="1D2433"/>
+                <w:sz w:val="18"/>
+                <w:szCs w:val="18"/>
+              </w:rPr>
+              <w:t xml:space="preserve">1968</w:t>
+            </w:r>
+          </w:p>
+        </w:tc>
+        <w:tc>
+          <w:tcPr>
+            <w:tcW w:type="dxa" w:w="1500"/>
+            <w:tcBorders>
+              <w:top w:val="single" w:color="C9D3E3" w:sz="4"/>
+              <w:left w:val="single" w:color="C9D3E3" w:sz="4"/>
+              <w:bottom w:val="single" w:color="C9D3E3" w:sz="4"/>
+              <w:right w:val="single" w:color="C9D3E3" w:sz="4"/>
+            </w:tcBorders>
+            <w:shd w:fill="FFFFFF" w:color="auto" w:val="clear"/>
+            <w:tcMar>
+              <w:top w:type="dxa" w:w="60"/>
+              <w:left w:type="dxa" w:w="100"/>
+              <w:bottom w:type="dxa" w:w="60"/>
+              <w:right w:type="dxa" w:w="100"/>
+            </w:tcMar>
+          </w:tcPr>
+          <w:p>
+            <w:pPr>
+              <w:spacing w:after="20" w:line="252"/>
+            </w:pPr>
+            <w:r>
+              <w:rPr>
+                <w:rFonts w:ascii="Nunito" w:cs="Nunito" w:eastAsia="Nunito" w:hAnsi="Nunito"/>
+                <w:color w:val="1D2433"/>
+                <w:sz w:val="18"/>
+                <w:szCs w:val="18"/>
+              </w:rPr>
+              <w:t xml:space="preserve">58 ans</w:t>
+            </w:r>
+          </w:p>
+        </w:tc>
+        <w:tc>
+          <w:tcPr>
+            <w:tcW w:type="dxa" w:w="1400"/>
+            <w:tcBorders>
+              <w:top w:val="single" w:color="C9D3E3" w:sz="4"/>
+              <w:left w:val="single" w:color="C9D3E3" w:sz="4"/>
+              <w:bottom w:val="single" w:color="C9D3E3" w:sz="4"/>
+              <w:right w:val="single" w:color="C9D3E3" w:sz="4"/>
+            </w:tcBorders>
+            <w:shd w:fill="FFFFFF" w:color="auto" w:val="clear"/>
+            <w:tcMar>
+              <w:top w:type="dxa" w:w="60"/>
+              <w:left w:type="dxa" w:w="100"/>
+              <w:bottom w:type="dxa" w:w="60"/>
+              <w:right w:type="dxa" w:w="100"/>
+            </w:tcMar>
+          </w:tcPr>
+          <w:p>
+            <w:pPr>
+              <w:spacing w:after="20" w:line="252"/>
+            </w:pPr>
+            <w:r>
+              <w:rPr>
+                <w:rFonts w:ascii="Nunito" w:cs="Nunito" w:eastAsia="Nunito" w:hAnsi="Nunito"/>
+                <w:color w:val="1D2433"/>
+                <w:sz w:val="18"/>
+                <w:szCs w:val="18"/>
+              </w:rPr>
+              <w:t xml:space="preserve">60 ans</w:t>
+            </w:r>
+          </w:p>
+        </w:tc>
+        <w:tc>
+          <w:tcPr>
+            <w:tcW w:type="dxa" w:w="1700"/>
+            <w:tcBorders>
+              <w:top w:val="single" w:color="C9D3E3" w:sz="4"/>
+              <w:left w:val="single" w:color="C9D3E3" w:sz="4"/>
+              <w:bottom w:val="single" w:color="C9D3E3" w:sz="4"/>
+              <w:right w:val="single" w:color="C9D3E3" w:sz="4"/>
+            </w:tcBorders>
+            <w:shd w:fill="FFFFFF" w:color="auto" w:val="clear"/>
+            <w:tcMar>
+              <w:top w:type="dxa" w:w="60"/>
+              <w:left w:type="dxa" w:w="100"/>
+              <w:bottom w:type="dxa" w:w="60"/>
+              <w:right w:type="dxa" w:w="100"/>
+            </w:tcMar>
+          </w:tcPr>
+          <w:p>
+            <w:pPr>
+              <w:spacing w:after="20" w:line="252"/>
+            </w:pPr>
+            <w:r>
+              <w:rPr>
+                <w:rFonts w:ascii="Nunito" w:cs="Nunito" w:eastAsia="Nunito" w:hAnsi="Nunito"/>
+                <w:color w:val="1D2433"/>
+                <w:sz w:val="18"/>
+                <w:szCs w:val="18"/>
+              </w:rPr>
+              <w:t xml:space="preserve">61 ans 3 mois</w:t>
+            </w:r>
+          </w:p>
+        </w:tc>
+        <w:tc>
+          <w:tcPr>
+            <w:tcW w:type="dxa" w:w="1300"/>
+            <w:tcBorders>
+              <w:top w:val="single" w:color="C9D3E3" w:sz="4"/>
+              <w:left w:val="single" w:color="C9D3E3" w:sz="4"/>
+              <w:bottom w:val="single" w:color="C9D3E3" w:sz="4"/>
+              <w:right w:val="single" w:color="C9D3E3" w:sz="4"/>
+            </w:tcBorders>
+            <w:shd w:fill="FFFFFF" w:color="auto" w:val="clear"/>
+            <w:tcMar>
+              <w:top w:type="dxa" w:w="60"/>
+              <w:left w:type="dxa" w:w="100"/>
+              <w:bottom w:type="dxa" w:w="60"/>
+              <w:right w:type="dxa" w:w="100"/>
+            </w:tcMar>
+          </w:tcPr>
+          <w:p>
+            <w:pPr>
+              <w:spacing w:after="20" w:line="252"/>
+            </w:pPr>
+            <w:r>
+              <w:rPr>
+                <w:rFonts w:ascii="Nunito" w:cs="Nunito" w:eastAsia="Nunito" w:hAnsi="Nunito"/>
+                <w:color w:val="1D2433"/>
+                <w:sz w:val="18"/>
+                <w:szCs w:val="18"/>
+              </w:rPr>
+              <w:t xml:space="preserve">63 ans</w:t>
+            </w:r>
+          </w:p>
+        </w:tc>
+        <w:tc>
+          <w:tcPr>
+            <w:tcW w:type="dxa" w:w="1438"/>
+            <w:tcBorders>
+              <w:top w:val="single" w:color="C9D3E3" w:sz="4"/>
+              <w:left w:val="single" w:color="C9D3E3" w:sz="4"/>
+              <w:bottom w:val="single" w:color="C9D3E3" w:sz="4"/>
+              <w:right w:val="single" w:color="C9D3E3" w:sz="4"/>
+            </w:tcBorders>
+            <w:shd w:fill="FFFFFF" w:color="auto" w:val="clear"/>
+            <w:tcMar>
+              <w:top w:type="dxa" w:w="60"/>
+              <w:left w:type="dxa" w:w="100"/>
+              <w:bottom w:type="dxa" w:w="60"/>
+              <w:right w:type="dxa" w:w="100"/>
+            </w:tcMar>
+          </w:tcPr>
+          <w:p>
+            <w:pPr>
+              <w:spacing w:after="20" w:line="252"/>
+            </w:pPr>
+            <w:r>
+              <w:rPr>
+                <w:rFonts w:ascii="Nunito" w:cs="Nunito" w:eastAsia="Nunito" w:hAnsi="Nunito"/>
+                <w:color w:val="1D2433"/>
+                <w:sz w:val="18"/>
+                <w:szCs w:val="18"/>
+              </w:rPr>
+              <w:t xml:space="preserve">172</w:t>
+            </w:r>
+          </w:p>
+        </w:tc>
+      </w:tr>
+      <w:tr>
+        <w:trPr>
+          <w:cantSplit/>
+          <w:tblHeader w:val="off"/>
+        </w:trPr>
+        <w:tc>
+          <w:tcPr>
+            <w:tcW w:type="dxa" w:w="2300"/>
+            <w:tcBorders>
+              <w:top w:val="single" w:color="C9D3E3" w:sz="4"/>
+              <w:left w:val="single" w:color="C9D3E3" w:sz="4"/>
+              <w:bottom w:val="single" w:color="C9D3E3" w:sz="4"/>
+              <w:right w:val="single" w:color="C9D3E3" w:sz="4"/>
+            </w:tcBorders>
+            <w:shd w:fill="E8F1FC" w:color="auto" w:val="clear"/>
+            <w:tcMar>
+              <w:top w:type="dxa" w:w="60"/>
+              <w:left w:type="dxa" w:w="100"/>
+              <w:bottom w:type="dxa" w:w="60"/>
+              <w:right w:type="dxa" w:w="100"/>
+            </w:tcMar>
+          </w:tcPr>
+          <w:p>
+            <w:pPr>
+              <w:spacing w:after="20" w:line="252"/>
+            </w:pPr>
+            <w:r>
+              <w:rPr>
+                <w:rFonts w:ascii="Nunito" w:cs="Nunito" w:eastAsia="Nunito" w:hAnsi="Nunito"/>
+                <w:color w:val="1D2433"/>
+                <w:sz w:val="18"/>
+                <w:szCs w:val="18"/>
+              </w:rPr>
+              <w:t xml:space="preserve">1969</w:t>
+            </w:r>
+          </w:p>
+        </w:tc>
+        <w:tc>
+          <w:tcPr>
+            <w:tcW w:type="dxa" w:w="1500"/>
+            <w:tcBorders>
+              <w:top w:val="single" w:color="C9D3E3" w:sz="4"/>
+              <w:left w:val="single" w:color="C9D3E3" w:sz="4"/>
+              <w:bottom w:val="single" w:color="C9D3E3" w:sz="4"/>
+              <w:right w:val="single" w:color="C9D3E3" w:sz="4"/>
+            </w:tcBorders>
+            <w:shd w:fill="E8F1FC" w:color="auto" w:val="clear"/>
+            <w:tcMar>
+              <w:top w:type="dxa" w:w="60"/>
+              <w:left w:type="dxa" w:w="100"/>
+              <w:bottom w:type="dxa" w:w="60"/>
+              <w:right w:type="dxa" w:w="100"/>
+            </w:tcMar>
+          </w:tcPr>
+          <w:p>
+            <w:pPr>
+              <w:spacing w:after="20" w:line="252"/>
+            </w:pPr>
+            <w:r>
+              <w:rPr>
+                <w:rFonts w:ascii="Nunito" w:cs="Nunito" w:eastAsia="Nunito" w:hAnsi="Nunito"/>
+                <w:color w:val="1D2433"/>
+                <w:sz w:val="18"/>
+                <w:szCs w:val="18"/>
+              </w:rPr>
+              <w:t xml:space="preserve">58 ans</w:t>
+            </w:r>
+          </w:p>
+        </w:tc>
+        <w:tc>
+          <w:tcPr>
+            <w:tcW w:type="dxa" w:w="1400"/>
+            <w:tcBorders>
+              <w:top w:val="single" w:color="C9D3E3" w:sz="4"/>
+              <w:left w:val="single" w:color="C9D3E3" w:sz="4"/>
+              <w:bottom w:val="single" w:color="C9D3E3" w:sz="4"/>
+              <w:right w:val="single" w:color="C9D3E3" w:sz="4"/>
+            </w:tcBorders>
+            <w:shd w:fill="E8F1FC" w:color="auto" w:val="clear"/>
+            <w:tcMar>
+              <w:top w:type="dxa" w:w="60"/>
+              <w:left w:type="dxa" w:w="100"/>
+              <w:bottom w:type="dxa" w:w="60"/>
+              <w:right w:type="dxa" w:w="100"/>
+            </w:tcMar>
+          </w:tcPr>
+          <w:p>
+            <w:pPr>
+              <w:spacing w:after="20" w:line="252"/>
+            </w:pPr>
+            <w:r>
+              <w:rPr>
+                <w:rFonts w:ascii="Nunito" w:cs="Nunito" w:eastAsia="Nunito" w:hAnsi="Nunito"/>
+                <w:color w:val="1D2433"/>
+                <w:sz w:val="18"/>
+                <w:szCs w:val="18"/>
+              </w:rPr>
+              <w:t xml:space="preserve">60 ans</w:t>
+            </w:r>
+          </w:p>
+        </w:tc>
+        <w:tc>
+          <w:tcPr>
+            <w:tcW w:type="dxa" w:w="1700"/>
+            <w:tcBorders>
+              <w:top w:val="single" w:color="C9D3E3" w:sz="4"/>
+              <w:left w:val="single" w:color="C9D3E3" w:sz="4"/>
+              <w:bottom w:val="single" w:color="C9D3E3" w:sz="4"/>
+              <w:right w:val="single" w:color="C9D3E3" w:sz="4"/>
+            </w:tcBorders>
+            <w:shd w:fill="E8F1FC" w:color="auto" w:val="clear"/>
+            <w:tcMar>
+              <w:top w:type="dxa" w:w="60"/>
+              <w:left w:type="dxa" w:w="100"/>
+              <w:bottom w:type="dxa" w:w="60"/>
+              <w:right w:type="dxa" w:w="100"/>
+            </w:tcMar>
+          </w:tcPr>
+          <w:p>
+            <w:pPr>
+              <w:spacing w:after="20" w:line="252"/>
+            </w:pPr>
+            <w:r>
+              <w:rPr>
+                <w:rFonts w:ascii="Nunito" w:cs="Nunito" w:eastAsia="Nunito" w:hAnsi="Nunito"/>
+                <w:color w:val="1D2433"/>
+                <w:sz w:val="18"/>
+                <w:szCs w:val="18"/>
+              </w:rPr>
+              <w:t xml:space="preserve">61 ans 6 mois</w:t>
+            </w:r>
+          </w:p>
+        </w:tc>
+        <w:tc>
+          <w:tcPr>
+            <w:tcW w:type="dxa" w:w="1300"/>
+            <w:tcBorders>
+              <w:top w:val="single" w:color="C9D3E3" w:sz="4"/>
+              <w:left w:val="single" w:color="C9D3E3" w:sz="4"/>
+              <w:bottom w:val="single" w:color="C9D3E3" w:sz="4"/>
+              <w:right w:val="single" w:color="C9D3E3" w:sz="4"/>
+            </w:tcBorders>
+            <w:shd w:fill="E8F1FC" w:color="auto" w:val="clear"/>
+            <w:tcMar>
+              <w:top w:type="dxa" w:w="60"/>
+              <w:left w:type="dxa" w:w="100"/>
+              <w:bottom w:type="dxa" w:w="60"/>
+              <w:right w:type="dxa" w:w="100"/>
+            </w:tcMar>
+          </w:tcPr>
+          <w:p>
+            <w:pPr>
+              <w:spacing w:after="20" w:line="252"/>
+            </w:pPr>
+            <w:r>
+              <w:rPr>
+                <w:rFonts w:ascii="Nunito" w:cs="Nunito" w:eastAsia="Nunito" w:hAnsi="Nunito"/>
+                <w:color w:val="1D2433"/>
+                <w:sz w:val="18"/>
+                <w:szCs w:val="18"/>
+              </w:rPr>
+              <w:t xml:space="preserve">63 ans</w:t>
+            </w:r>
+          </w:p>
+        </w:tc>
+        <w:tc>
+          <w:tcPr>
+            <w:tcW w:type="dxa" w:w="1438"/>
+            <w:tcBorders>
+              <w:top w:val="single" w:color="C9D3E3" w:sz="4"/>
+              <w:left w:val="single" w:color="C9D3E3" w:sz="4"/>
+              <w:bottom w:val="single" w:color="C9D3E3" w:sz="4"/>
+              <w:right w:val="single" w:color="C9D3E3" w:sz="4"/>
+            </w:tcBorders>
+            <w:shd w:fill="E8F1FC" w:color="auto" w:val="clear"/>
+            <w:tcMar>
+              <w:top w:type="dxa" w:w="60"/>
+              <w:left w:type="dxa" w:w="100"/>
+              <w:bottom w:type="dxa" w:w="60"/>
+              <w:right w:type="dxa" w:w="100"/>
+            </w:tcMar>
+          </w:tcPr>
+          <w:p>
+            <w:pPr>
+              <w:spacing w:after="20" w:line="252"/>
+            </w:pPr>
+            <w:r>
+              <w:rPr>
+                <w:rFonts w:ascii="Nunito" w:cs="Nunito" w:eastAsia="Nunito" w:hAnsi="Nunito"/>
+                <w:color w:val="1D2433"/>
+                <w:sz w:val="18"/>
+                <w:szCs w:val="18"/>
+              </w:rPr>
+              <w:t xml:space="preserve">172</w:t>
+            </w:r>
+          </w:p>
+        </w:tc>
+      </w:tr>
+      <w:tr>
+        <w:trPr>
+          <w:cantSplit/>
+          <w:tblHeader w:val="off"/>
+        </w:trPr>
+        <w:tc>
+          <w:tcPr>
+            <w:tcW w:type="dxa" w:w="2300"/>
+            <w:tcBorders>
+              <w:top w:val="single" w:color="C9D3E3" w:sz="4"/>
+              <w:left w:val="single" w:color="C9D3E3" w:sz="4"/>
+              <w:bottom w:val="single" w:color="C9D3E3" w:sz="4"/>
+              <w:right w:val="single" w:color="C9D3E3" w:sz="4"/>
+            </w:tcBorders>
+            <w:shd w:fill="FFFFFF" w:color="auto" w:val="clear"/>
+            <w:tcMar>
+              <w:top w:type="dxa" w:w="60"/>
+              <w:left w:type="dxa" w:w="100"/>
+              <w:bottom w:type="dxa" w:w="60"/>
+              <w:right w:type="dxa" w:w="100"/>
+            </w:tcMar>
+          </w:tcPr>
+          <w:p>
+            <w:pPr>
+              <w:spacing w:after="20" w:line="252"/>
+            </w:pPr>
+            <w:r>
+              <w:rPr>
+                <w:rFonts w:ascii="Nunito" w:cs="Nunito" w:eastAsia="Nunito" w:hAnsi="Nunito"/>
+                <w:color w:val="1D2433"/>
+                <w:sz w:val="18"/>
+                <w:szCs w:val="18"/>
+              </w:rPr>
+              <w:t xml:space="preserve">1970</w:t>
+            </w:r>
+          </w:p>
+        </w:tc>
+        <w:tc>
+          <w:tcPr>
+            <w:tcW w:type="dxa" w:w="1500"/>
+            <w:tcBorders>
+              <w:top w:val="single" w:color="C9D3E3" w:sz="4"/>
+              <w:left w:val="single" w:color="C9D3E3" w:sz="4"/>
+              <w:bottom w:val="single" w:color="C9D3E3" w:sz="4"/>
+              <w:right w:val="single" w:color="C9D3E3" w:sz="4"/>
+            </w:tcBorders>
+            <w:shd w:fill="FFFFFF" w:color="auto" w:val="clear"/>
+            <w:tcMar>
+              <w:top w:type="dxa" w:w="60"/>
+              <w:left w:type="dxa" w:w="100"/>
+              <w:bottom w:type="dxa" w:w="60"/>
+              <w:right w:type="dxa" w:w="100"/>
+            </w:tcMar>
+          </w:tcPr>
+          <w:p>
+            <w:pPr>
+              <w:spacing w:after="20" w:line="252"/>
+            </w:pPr>
+            <w:r>
+              <w:rPr>
+                <w:rFonts w:ascii="Nunito" w:cs="Nunito" w:eastAsia="Nunito" w:hAnsi="Nunito"/>
+                <w:color w:val="1D2433"/>
+                <w:sz w:val="18"/>
+                <w:szCs w:val="18"/>
+              </w:rPr>
+              <w:t xml:space="preserve">58 ans</w:t>
+            </w:r>
+          </w:p>
+        </w:tc>
+        <w:tc>
+          <w:tcPr>
+            <w:tcW w:type="dxa" w:w="1400"/>
+            <w:tcBorders>
+              <w:top w:val="single" w:color="C9D3E3" w:sz="4"/>
+              <w:left w:val="single" w:color="C9D3E3" w:sz="4"/>
+              <w:bottom w:val="single" w:color="C9D3E3" w:sz="4"/>
+              <w:right w:val="single" w:color="C9D3E3" w:sz="4"/>
+            </w:tcBorders>
+            <w:shd w:fill="FFFFFF" w:color="auto" w:val="clear"/>
+            <w:tcMar>
+              <w:top w:type="dxa" w:w="60"/>
+              <w:left w:type="dxa" w:w="100"/>
+              <w:bottom w:type="dxa" w:w="60"/>
+              <w:right w:type="dxa" w:w="100"/>
+            </w:tcMar>
+          </w:tcPr>
+          <w:p>
+            <w:pPr>
+              <w:spacing w:after="20" w:line="252"/>
+            </w:pPr>
+            <w:r>
+              <w:rPr>
+                <w:rFonts w:ascii="Nunito" w:cs="Nunito" w:eastAsia="Nunito" w:hAnsi="Nunito"/>
+                <w:color w:val="1D2433"/>
+                <w:sz w:val="18"/>
+                <w:szCs w:val="18"/>
+              </w:rPr>
+              <w:t xml:space="preserve">60 ans</w:t>
+            </w:r>
+          </w:p>
+        </w:tc>
+        <w:tc>
+          <w:tcPr>
+            <w:tcW w:type="dxa" w:w="1700"/>
+            <w:tcBorders>
+              <w:top w:val="single" w:color="C9D3E3" w:sz="4"/>
+              <w:left w:val="single" w:color="C9D3E3" w:sz="4"/>
+              <w:bottom w:val="single" w:color="C9D3E3" w:sz="4"/>
+              <w:right w:val="single" w:color="C9D3E3" w:sz="4"/>
+            </w:tcBorders>
+            <w:shd w:fill="FFFFFF" w:color="auto" w:val="clear"/>
+            <w:tcMar>
+              <w:top w:type="dxa" w:w="60"/>
+              <w:left w:type="dxa" w:w="100"/>
+              <w:bottom w:type="dxa" w:w="60"/>
+              <w:right w:type="dxa" w:w="100"/>
+            </w:tcMar>
+          </w:tcPr>
+          <w:p>
+            <w:pPr>
+              <w:spacing w:after="20" w:line="252"/>
+            </w:pPr>
+            <w:r>
+              <w:rPr>
+                <w:rFonts w:ascii="Nunito" w:cs="Nunito" w:eastAsia="Nunito" w:hAnsi="Nunito"/>
+                <w:color w:val="1D2433"/>
+                <w:sz w:val="18"/>
+                <w:szCs w:val="18"/>
+              </w:rPr>
+              <w:t xml:space="preserve">61 ans 9 mois</w:t>
+            </w:r>
+          </w:p>
+        </w:tc>
+        <w:tc>
+          <w:tcPr>
+            <w:tcW w:type="dxa" w:w="1300"/>
+            <w:tcBorders>
+              <w:top w:val="single" w:color="C9D3E3" w:sz="4"/>
+              <w:left w:val="single" w:color="C9D3E3" w:sz="4"/>
+              <w:bottom w:val="single" w:color="C9D3E3" w:sz="4"/>
+              <w:right w:val="single" w:color="C9D3E3" w:sz="4"/>
+            </w:tcBorders>
+            <w:shd w:fill="FFFFFF" w:color="auto" w:val="clear"/>
+            <w:tcMar>
+              <w:top w:type="dxa" w:w="60"/>
+              <w:left w:type="dxa" w:w="100"/>
+              <w:bottom w:type="dxa" w:w="60"/>
+              <w:right w:type="dxa" w:w="100"/>
+            </w:tcMar>
+          </w:tcPr>
+          <w:p>
+            <w:pPr>
+              <w:spacing w:after="20" w:line="252"/>
+            </w:pPr>
+            <w:r>
+              <w:rPr>
+                <w:rFonts w:ascii="Nunito" w:cs="Nunito" w:eastAsia="Nunito" w:hAnsi="Nunito"/>
+                <w:color w:val="1D2433"/>
+                <w:sz w:val="18"/>
+                <w:szCs w:val="18"/>
+              </w:rPr>
+              <w:t xml:space="preserve">63 ans</w:t>
+            </w:r>
+          </w:p>
+        </w:tc>
+        <w:tc>
+          <w:tcPr>
+            <w:tcW w:type="dxa" w:w="1438"/>
+            <w:tcBorders>
+              <w:top w:val="single" w:color="C9D3E3" w:sz="4"/>
+              <w:left w:val="single" w:color="C9D3E3" w:sz="4"/>
+              <w:bottom w:val="single" w:color="C9D3E3" w:sz="4"/>
+              <w:right w:val="single" w:color="C9D3E3" w:sz="4"/>
+            </w:tcBorders>
+            <w:shd w:fill="FFFFFF" w:color="auto" w:val="clear"/>
+            <w:tcMar>
+              <w:top w:type="dxa" w:w="60"/>
+              <w:left w:type="dxa" w:w="100"/>
+              <w:bottom w:type="dxa" w:w="60"/>
+              <w:right w:type="dxa" w:w="100"/>
+            </w:tcMar>
+          </w:tcPr>
+          <w:p>
+            <w:pPr>
+              <w:spacing w:after="20" w:line="252"/>
+            </w:pPr>
+            <w:r>
+              <w:rPr>
+                <w:rFonts w:ascii="Nunito" w:cs="Nunito" w:eastAsia="Nunito" w:hAnsi="Nunito"/>
+                <w:color w:val="1D2433"/>
+                <w:sz w:val="18"/>
+                <w:szCs w:val="18"/>
+              </w:rPr>
+              <w:t xml:space="preserve">172</w:t>
+            </w:r>
+          </w:p>
+        </w:tc>
+      </w:tr>
+      <w:tr>
+        <w:trPr>
+          <w:cantSplit/>
+          <w:tblHeader w:val="off"/>
+        </w:trPr>
+        <w:tc>
+          <w:tcPr>
+            <w:tcW w:type="dxa" w:w="2300"/>
+            <w:tcBorders>
+              <w:top w:val="single" w:color="C9D3E3" w:sz="4"/>
+              <w:left w:val="single" w:color="C9D3E3" w:sz="4"/>
+              <w:bottom w:val="single" w:color="C9D3E3" w:sz="4"/>
+              <w:right w:val="single" w:color="C9D3E3" w:sz="4"/>
+            </w:tcBorders>
+            <w:shd w:fill="E8F1FC" w:color="auto" w:val="clear"/>
+            <w:tcMar>
+              <w:top w:type="dxa" w:w="60"/>
+              <w:left w:type="dxa" w:w="100"/>
+              <w:bottom w:type="dxa" w:w="60"/>
+              <w:right w:type="dxa" w:w="100"/>
+            </w:tcMar>
+          </w:tcPr>
+          <w:p>
+            <w:pPr>
+              <w:spacing w:after="20" w:line="252"/>
+            </w:pPr>
+            <w:r>
+              <w:rPr>
+                <w:rFonts w:ascii="Nunito" w:cs="Nunito" w:eastAsia="Nunito" w:hAnsi="Nunito"/>
+                <w:color w:val="1D2433"/>
+                <w:sz w:val="18"/>
+                <w:szCs w:val="18"/>
+              </w:rPr>
+              <w:t xml:space="preserve">À partir de 1971</w:t>
+            </w:r>
+          </w:p>
+        </w:tc>
+        <w:tc>
+          <w:tcPr>
+            <w:tcW w:type="dxa" w:w="1500"/>
+            <w:tcBorders>
+              <w:top w:val="single" w:color="C9D3E3" w:sz="4"/>
+              <w:left w:val="single" w:color="C9D3E3" w:sz="4"/>
+              <w:bottom w:val="single" w:color="C9D3E3" w:sz="4"/>
+              <w:right w:val="single" w:color="C9D3E3" w:sz="4"/>
+            </w:tcBorders>
+            <w:shd w:fill="E8F1FC" w:color="auto" w:val="clear"/>
+            <w:tcMar>
+              <w:top w:type="dxa" w:w="60"/>
+              <w:left w:type="dxa" w:w="100"/>
+              <w:bottom w:type="dxa" w:w="60"/>
+              <w:right w:type="dxa" w:w="100"/>
+            </w:tcMar>
+          </w:tcPr>
+          <w:p>
+            <w:pPr>
+              <w:spacing w:after="20" w:line="252"/>
+            </w:pPr>
+            <w:r>
+              <w:rPr>
+                <w:rFonts w:ascii="Nunito" w:cs="Nunito" w:eastAsia="Nunito" w:hAnsi="Nunito"/>
+                <w:color w:val="1D2433"/>
+                <w:sz w:val="18"/>
+                <w:szCs w:val="18"/>
+              </w:rPr>
+              <w:t xml:space="preserve">58 ans</w:t>
+            </w:r>
+          </w:p>
+        </w:tc>
+        <w:tc>
+          <w:tcPr>
+            <w:tcW w:type="dxa" w:w="1400"/>
+            <w:tcBorders>
+              <w:top w:val="single" w:color="C9D3E3" w:sz="4"/>
+              <w:left w:val="single" w:color="C9D3E3" w:sz="4"/>
+              <w:bottom w:val="single" w:color="C9D3E3" w:sz="4"/>
+              <w:right w:val="single" w:color="C9D3E3" w:sz="4"/>
+            </w:tcBorders>
+            <w:shd w:fill="E8F1FC" w:color="auto" w:val="clear"/>
+            <w:tcMar>
+              <w:top w:type="dxa" w:w="60"/>
+              <w:left w:type="dxa" w:w="100"/>
+              <w:bottom w:type="dxa" w:w="60"/>
+              <w:right w:type="dxa" w:w="100"/>
+            </w:tcMar>
+          </w:tcPr>
+          <w:p>
+            <w:pPr>
+              <w:spacing w:after="20" w:line="252"/>
+            </w:pPr>
+            <w:r>
+              <w:rPr>
+                <w:rFonts w:ascii="Nunito" w:cs="Nunito" w:eastAsia="Nunito" w:hAnsi="Nunito"/>
+                <w:color w:val="1D2433"/>
+                <w:sz w:val="18"/>
+                <w:szCs w:val="18"/>
+              </w:rPr>
+              <w:t xml:space="preserve">60 ans</w:t>
+            </w:r>
+          </w:p>
+        </w:tc>
+        <w:tc>
+          <w:tcPr>
+            <w:tcW w:type="dxa" w:w="1700"/>
+            <w:tcBorders>
+              <w:top w:val="single" w:color="C9D3E3" w:sz="4"/>
+              <w:left w:val="single" w:color="C9D3E3" w:sz="4"/>
+              <w:bottom w:val="single" w:color="C9D3E3" w:sz="4"/>
+              <w:right w:val="single" w:color="C9D3E3" w:sz="4"/>
+            </w:tcBorders>
+            <w:shd w:fill="E8F1FC" w:color="auto" w:val="clear"/>
+            <w:tcMar>
+              <w:top w:type="dxa" w:w="60"/>
+              <w:left w:type="dxa" w:w="100"/>
+              <w:bottom w:type="dxa" w:w="60"/>
+              <w:right w:type="dxa" w:w="100"/>
+            </w:tcMar>
+          </w:tcPr>
+          <w:p>
+            <w:pPr>
+              <w:spacing w:after="20" w:line="252"/>
+            </w:pPr>
+            <w:r>
+              <w:rPr>
+                <w:rFonts w:ascii="Nunito" w:cs="Nunito" w:eastAsia="Nunito" w:hAnsi="Nunito"/>
+                <w:color w:val="1D2433"/>
+                <w:sz w:val="18"/>
+                <w:szCs w:val="18"/>
+              </w:rPr>
+              <w:t xml:space="preserve">62 ans</w:t>
+            </w:r>
+          </w:p>
+        </w:tc>
+        <w:tc>
+          <w:tcPr>
+            <w:tcW w:type="dxa" w:w="1300"/>
+            <w:tcBorders>
+              <w:top w:val="single" w:color="C9D3E3" w:sz="4"/>
+              <w:left w:val="single" w:color="C9D3E3" w:sz="4"/>
+              <w:bottom w:val="single" w:color="C9D3E3" w:sz="4"/>
+              <w:right w:val="single" w:color="C9D3E3" w:sz="4"/>
+            </w:tcBorders>
+            <w:shd w:fill="E8F1FC" w:color="auto" w:val="clear"/>
+            <w:tcMar>
+              <w:top w:type="dxa" w:w="60"/>
+              <w:left w:type="dxa" w:w="100"/>
+              <w:bottom w:type="dxa" w:w="60"/>
+              <w:right w:type="dxa" w:w="100"/>
+            </w:tcMar>
+          </w:tcPr>
+          <w:p>
+            <w:pPr>
+              <w:spacing w:after="20" w:line="252"/>
+            </w:pPr>
+            <w:r>
+              <w:rPr>
+                <w:rFonts w:ascii="Nunito" w:cs="Nunito" w:eastAsia="Nunito" w:hAnsi="Nunito"/>
+                <w:color w:val="1D2433"/>
+                <w:sz w:val="18"/>
+                <w:szCs w:val="18"/>
+              </w:rPr>
+              <w:t xml:space="preserve">63 ans</w:t>
+            </w:r>
+          </w:p>
+        </w:tc>
+        <w:tc>
+          <w:tcPr>
+            <w:tcW w:type="dxa" w:w="1438"/>
+            <w:tcBorders>
+              <w:top w:val="single" w:color="C9D3E3" w:sz="4"/>
+              <w:left w:val="single" w:color="C9D3E3" w:sz="4"/>
+              <w:bottom w:val="single" w:color="C9D3E3" w:sz="4"/>
+              <w:right w:val="single" w:color="C9D3E3" w:sz="4"/>
+            </w:tcBorders>
+            <w:shd w:fill="E8F1FC" w:color="auto" w:val="clear"/>
+            <w:tcMar>
+              <w:top w:type="dxa" w:w="60"/>
+              <w:left w:type="dxa" w:w="100"/>
+              <w:bottom w:type="dxa" w:w="60"/>
+              <w:right w:type="dxa" w:w="100"/>
+            </w:tcMar>
+          </w:tcPr>
+          <w:p>
+            <w:pPr>
+              <w:spacing w:after="20" w:line="252"/>
+            </w:pPr>
+            <w:r>
+              <w:rPr>
+                <w:rFonts w:ascii="Nunito" w:cs="Nunito" w:eastAsia="Nunito" w:hAnsi="Nunito"/>
+                <w:color w:val="1D2433"/>
+                <w:sz w:val="18"/>
+                <w:szCs w:val="18"/>
+              </w:rPr>
+              <w:t xml:space="preserve">172</w:t>
+            </w:r>
+          </w:p>
+        </w:tc>
+      </w:tr>
+    </w:tbl>
+    <w:p>
+      <w:pPr>
+        <w:spacing w:after="80"/>
+      </w:pPr>
     </w:p>
     <w:tbl>
       <w:tblPr>
@@ -4292,6 +7276,119 @@
           <w:tcPr>
             <w:tcW w:type="dxa" w:w="9638"/>
             <w:tcBorders>
+              <w:top w:val="single" w:color="FBF7EF" w:sz="4"/>
+              <w:left w:val="single" w:color="C8A96B" w:sz="24"/>
+              <w:bottom w:val="single" w:color="FBF7EF" w:sz="4"/>
+              <w:right w:val="single" w:color="FBF7EF" w:sz="4"/>
+            </w:tcBorders>
+            <w:shd w:fill="FBF7EF" w:color="auto" w:val="clear"/>
+            <w:tcMar>
+              <w:top w:type="dxa" w:w="100"/>
+              <w:left w:type="dxa" w:w="180"/>
+              <w:bottom w:type="dxa" w:w="100"/>
+              <w:right w:type="dxa" w:w="160"/>
+            </w:tcMar>
+          </w:tcPr>
+          <w:p>
+            <w:pPr>
+              <w:keepNext/>
+              <w:spacing w:after="60"/>
+            </w:pPr>
+            <w:r>
+              <w:rPr>
+                <w:rFonts w:ascii="Nunito" w:cs="Nunito" w:eastAsia="Nunito" w:hAnsi="Nunito"/>
+                <w:b/>
+                <w:bCs/>
+                <w:color w:val="8A6A2C"/>
+                <w:sz w:val="17"/>
+                <w:szCs w:val="17"/>
+              </w:rPr>
+              <w:t xml:space="preserve">TRIMESTRES COTISÉS ET « RÉPUTÉS COTISÉS »</w:t>
+            </w:r>
+          </w:p>
+          <w:p>
+            <w:pPr>
+              <w:keepNext/>
+              <w:keepLines/>
+              <w:spacing w:after="60" w:line="264"/>
+            </w:pPr>
+            <w:r>
+              <w:rPr>
+                <w:rFonts w:ascii="Nunito" w:cs="Nunito" w:eastAsia="Nunito" w:hAnsi="Nunito"/>
+                <w:color w:val="1D2433"/>
+                <w:sz w:val="19"/>
+                <w:szCs w:val="19"/>
+              </w:rPr>
+              <w:t xml:space="preserve">Comptent sans limite : les trimestres cotisés et la maternité. Comptent dans la limite de </w:t>
+            </w:r>
+            <w:r>
+              <w:rPr>
+                <w:rFonts w:ascii="Nunito" w:cs="Nunito" w:eastAsia="Nunito" w:hAnsi="Nunito"/>
+                <w:b/>
+                <w:bCs/>
+                <w:color w:val="1D2433"/>
+                <w:sz w:val="19"/>
+                <w:szCs w:val="19"/>
+              </w:rPr>
+              <w:t xml:space="preserve">4 trimestres</w:t>
+            </w:r>
+            <w:r>
+              <w:rPr>
+                <w:rFonts w:ascii="Nunito" w:cs="Nunito" w:eastAsia="Nunito" w:hAnsi="Nunito"/>
+                <w:color w:val="1D2433"/>
+                <w:sz w:val="19"/>
+                <w:szCs w:val="19"/>
+              </w:rPr>
+              <w:t xml:space="preserve"> chacun sur toute la carrière : service national, maladie et accident du travail, chômage indemnisé, assurance vieillesse du parent au foyer, assurance vieillesse des aidants.</w:t>
+            </w:r>
+          </w:p>
+          <w:p>
+            <w:pPr>
+              <w:keepNext/>
+              <w:keepLines/>
+              <w:spacing w:after="60" w:line="264"/>
+            </w:pPr>
+            <w:r>
+              <w:rPr>
+                <w:rFonts w:ascii="Nunito" w:cs="Nunito" w:eastAsia="Nunito" w:hAnsi="Nunito"/>
+                <w:color w:val="1D2433"/>
+                <w:sz w:val="19"/>
+                <w:szCs w:val="19"/>
+              </w:rPr>
+              <w:t xml:space="preserve">Ne comptent pas : les majorations de durée pour enfant (les 8 trimestres de Mme DUPONT, par exemple).</w:t>
+            </w:r>
+          </w:p>
+        </w:tc>
+      </w:tr>
+    </w:tbl>
+    <w:p>
+      <w:pPr>
+        <w:spacing w:after="80"/>
+      </w:pPr>
+    </w:p>
+    <w:tbl>
+      <w:tblPr>
+        <w:tblW w:type="dxa" w:w="9638"/>
+        <w:tblBorders>
+          <w:top w:val="single" w:color="auto" w:sz="4"/>
+          <w:left w:val="single" w:color="auto" w:sz="4"/>
+          <w:bottom w:val="single" w:color="auto" w:sz="4"/>
+          <w:right w:val="single" w:color="auto" w:sz="4"/>
+          <w:insideH w:val="single" w:color="auto" w:sz="4"/>
+          <w:insideV w:val="single" w:color="auto" w:sz="4"/>
+        </w:tblBorders>
+      </w:tblPr>
+      <w:tblGrid>
+        <w:gridCol w:w="9638"/>
+      </w:tblGrid>
+      <w:tr>
+        <w:trPr>
+          <w:cantSplit/>
+        </w:trPr>
+        <w:tc>
+          <w:tcPr>
+            <w:tcW w:type="dxa" w:w="9638"/>
+            <w:tcBorders>
               <w:top w:val="single" w:color="FBEDEC" w:sz="4"/>
               <w:left w:val="single" w:color="B3261E" w:sz="24"/>
               <w:bottom w:val="single" w:color="FBEDEC" w:sz="4"/>
@@ -4319,7 +7416,7 @@
                 <w:sz w:val="17"/>
                 <w:szCs w:val="17"/>
               </w:rPr>
-              <w:t xml:space="preserve">UN SIGNAL N'EST PAS UN DROIT</w:t>
+              <w:t xml:space="preserve">LE GESTIONNAIRE DÉCLENCHE L'ÉTUDE</w:t>
             </w:r>
           </w:p>
           <w:p>
@@ -4335,63 +7432,7 @@
                 <w:sz w:val="19"/>
                 <w:szCs w:val="19"/>
               </w:rPr>
-              <w:t xml:space="preserve">Il faut aussi une durée d'assurance </w:t>
-            </w:r>
-            <w:r>
-              <w:rPr>
-                <w:rFonts w:ascii="Nunito" w:cs="Nunito" w:eastAsia="Nunito" w:hAnsi="Nunito"/>
-                <w:b/>
-                <w:bCs/>
-                <w:color w:val="1D2433"/>
-                <w:sz w:val="19"/>
-                <w:szCs w:val="19"/>
-              </w:rPr>
-              <w:t xml:space="preserve">cotisée</w:t>
-            </w:r>
-            <w:r>
-              <w:rPr>
-                <w:rFonts w:ascii="Nunito" w:cs="Nunito" w:eastAsia="Nunito" w:hAnsi="Nunito"/>
-                <w:color w:val="1D2433"/>
-                <w:sz w:val="19"/>
-                <w:szCs w:val="19"/>
-              </w:rPr>
-              <w:t xml:space="preserve"> suffisante : les trimestres de majoration pour enfant n'en font pas partie, et les trimestres de chômage, de maladie ou de service national ne sont retenus que dans certaines limites.</w:t>
-            </w:r>
-          </w:p>
-          <w:p>
-            <w:pPr>
-              <w:keepNext/>
-              <w:keepLines/>
-              <w:spacing w:after="60" w:line="264"/>
-            </w:pPr>
-            <w:r>
-              <w:rPr>
-                <w:rFonts w:ascii="Nunito" w:cs="Nunito" w:eastAsia="Nunito" w:hAnsi="Nunito"/>
-                <w:color w:val="1D2433"/>
-                <w:sz w:val="19"/>
-                <w:szCs w:val="19"/>
-              </w:rPr>
-              <w:t xml:space="preserve">L'âge de départ dépend de la génération et de l'âge de début de carrière. Le gestionnaire </w:t>
-            </w:r>
-            <w:r>
-              <w:rPr>
-                <w:rFonts w:ascii="Nunito" w:cs="Nunito" w:eastAsia="Nunito" w:hAnsi="Nunito"/>
-                <w:b/>
-                <w:bCs/>
-                <w:color w:val="1D2433"/>
-                <w:sz w:val="19"/>
-                <w:szCs w:val="19"/>
-              </w:rPr>
-              <w:t xml:space="preserve">repère le signal et déclenche l'étude</w:t>
-            </w:r>
-            <w:r>
-              <w:rPr>
-                <w:rFonts w:ascii="Nunito" w:cs="Nunito" w:eastAsia="Nunito" w:hAnsi="Nunito"/>
-                <w:color w:val="1D2433"/>
-                <w:sz w:val="19"/>
-                <w:szCs w:val="19"/>
-              </w:rPr>
-              <w:t xml:space="preserve"> ; il ne promet jamais une date au téléphone.</w:t>
+              <w:t xml:space="preserve">L'étude se fait sur le relevé tous régimes : le gestionnaire signale le droit possible, vérifie les deux conditions et propose la date d'effet. Il ne promet jamais une date au téléphone sans cette vérification.</w:t>
             </w:r>
           </w:p>
         </w:tc>
@@ -4412,7 +7453,7 @@
           <w:sz w:val="25"/>
           <w:szCs w:val="25"/>
         </w:rPr>
-        <w:t xml:space="preserve">Repérage</w:t>
+        <w:t xml:space="preserve">Étude des 4 assurés</w:t>
       </w:r>
     </w:p>
     <w:tbl>
@@ -4428,10 +7469,11 @@
         </w:tblBorders>
       </w:tblPr>
       <w:tblGrid>
-        <w:gridCol w:w="2700"/>
-        <w:gridCol w:w="2700"/>
+        <w:gridCol w:w="2000"/>
         <w:gridCol w:w="1900"/>
-        <w:gridCol w:w="2338"/>
+        <w:gridCol w:w="1700"/>
+        <w:gridCol w:w="1900"/>
+        <w:gridCol w:w="2138"/>
       </w:tblGrid>
       <w:tr>
         <w:trPr>
@@ -4440,7 +7482,7 @@
         </w:trPr>
         <w:tc>
           <w:tcPr>
-            <w:tcW w:type="dxa" w:w="2700"/>
+            <w:tcW w:type="dxa" w:w="2000"/>
             <w:tcBorders>
               <w:top w:val="single" w:color="C9D3E3" w:sz="4"/>
               <w:left w:val="single" w:color="C9D3E3" w:sz="4"/>
@@ -4474,7 +7516,7 @@
         </w:tc>
         <w:tc>
           <w:tcPr>
-            <w:tcW w:type="dxa" w:w="2700"/>
+            <w:tcW w:type="dxa" w:w="1900"/>
             <w:tcBorders>
               <w:top w:val="single" w:color="C9D3E3" w:sz="4"/>
               <w:left w:val="single" w:color="C9D3E3" w:sz="4"/>
@@ -4502,13 +7544,13 @@
                 <w:sz w:val="18"/>
                 <w:szCs w:val="18"/>
               </w:rPr>
-              <w:t xml:space="preserve">Trimestres avant la fin de l'année des…</w:t>
-            </w:r>
-          </w:p>
-        </w:tc>
-        <w:tc>
-          <w:tcPr>
-            <w:tcW w:type="dxa" w:w="1900"/>
+              <w:t xml:space="preserve">Condition 1</w:t>
+            </w:r>
+          </w:p>
+        </w:tc>
+        <w:tc>
+          <w:tcPr>
+            <w:tcW w:type="dxa" w:w="1700"/>
             <w:tcBorders>
               <w:top w:val="single" w:color="C9D3E3" w:sz="4"/>
               <w:left w:val="single" w:color="C9D3E3" w:sz="4"/>
@@ -4536,13 +7578,47 @@
                 <w:sz w:val="18"/>
                 <w:szCs w:val="18"/>
               </w:rPr>
-              <w:t xml:space="preserve">Seuil atteint ?</w:t>
-            </w:r>
-          </w:p>
-        </w:tc>
-        <w:tc>
-          <w:tcPr>
-            <w:tcW w:type="dxa" w:w="2338"/>
+              <w:t xml:space="preserve">Âge · durée exigée</w:t>
+            </w:r>
+          </w:p>
+        </w:tc>
+        <w:tc>
+          <w:tcPr>
+            <w:tcW w:type="dxa" w:w="1900"/>
+            <w:tcBorders>
+              <w:top w:val="single" w:color="C9D3E3" w:sz="4"/>
+              <w:left w:val="single" w:color="C9D3E3" w:sz="4"/>
+              <w:bottom w:val="single" w:color="C9D3E3" w:sz="4"/>
+              <w:right w:val="single" w:color="C9D3E3" w:sz="4"/>
+            </w:tcBorders>
+            <w:shd w:fill="0D2B56" w:color="auto" w:val="clear"/>
+            <w:tcMar>
+              <w:top w:type="dxa" w:w="60"/>
+              <w:left w:type="dxa" w:w="100"/>
+              <w:bottom w:type="dxa" w:w="60"/>
+              <w:right w:type="dxa" w:w="100"/>
+            </w:tcMar>
+          </w:tcPr>
+          <w:p>
+            <w:pPr>
+              <w:spacing w:after="20" w:line="252"/>
+            </w:pPr>
+            <w:r>
+              <w:rPr>
+                <w:rFonts w:ascii="Nunito" w:cs="Nunito" w:eastAsia="Nunito" w:hAnsi="Nunito"/>
+                <w:b/>
+                <w:bCs/>
+                <w:color w:val="FFFFFF"/>
+                <w:sz w:val="18"/>
+                <w:szCs w:val="18"/>
+              </w:rPr>
+              <w:t xml:space="preserve">Durée cotisée atteinte</w:t>
+            </w:r>
+          </w:p>
+        </w:tc>
+        <w:tc>
+          <w:tcPr>
+            <w:tcW w:type="dxa" w:w="2138"/>
             <w:tcBorders>
               <w:top w:val="single" w:color="C9D3E3" w:sz="4"/>
               <w:left w:val="single" w:color="C9D3E3" w:sz="4"/>
@@ -4582,57 +7658,34 @@
         </w:trPr>
         <w:tc>
           <w:tcPr>
-            <w:tcW w:type="dxa" w:w="2700"/>
-            <w:tcBorders>
-              <w:top w:val="single" w:color="C9D3E3" w:sz="4"/>
-              <w:left w:val="single" w:color="C9D3E3" w:sz="4"/>
-              <w:bottom w:val="single" w:color="C9D3E3" w:sz="4"/>
-              <w:right w:val="single" w:color="C9D3E3" w:sz="4"/>
-            </w:tcBorders>
-            <w:shd w:fill="E8F1FC" w:color="auto" w:val="clear"/>
-            <w:tcMar>
-              <w:top w:type="dxa" w:w="60"/>
-              <w:left w:type="dxa" w:w="100"/>
-              <w:bottom w:type="dxa" w:w="60"/>
-              <w:right w:type="dxa" w:w="100"/>
-            </w:tcMar>
-          </w:tcPr>
-          <w:p>
-            <w:pPr>
-              <w:spacing w:after="20" w:line="252"/>
-            </w:pPr>
-            <w:r>
-              <w:rPr>
-                <w:rFonts w:ascii="Nunito" w:cs="Nunito" w:eastAsia="Nunito" w:hAnsi="Nunito"/>
-                <w:color w:val="1D2433"/>
-                <w:sz w:val="18"/>
-                <w:szCs w:val="18"/>
-              </w:rPr>
-              <w:t xml:space="preserve">M. VASSEUR, né le 03/11/1963 (4e trimestre)</w:t>
-            </w:r>
-          </w:p>
-        </w:tc>
-        <w:tc>
-          <w:tcPr>
-            <w:tcW w:type="dxa" w:w="2700"/>
-            <w:tcBorders>
-              <w:top w:val="single" w:color="C9D3E3" w:sz="4"/>
-              <w:left w:val="single" w:color="C9D3E3" w:sz="4"/>
-              <w:bottom w:val="single" w:color="C9D3E3" w:sz="4"/>
-              <w:right w:val="single" w:color="C9D3E3" w:sz="4"/>
-            </w:tcBorders>
-            <w:shd w:fill="E8F1FC" w:color="auto" w:val="clear"/>
-            <w:tcMar>
-              <w:top w:type="dxa" w:w="60"/>
-              <w:left w:type="dxa" w:w="100"/>
-              <w:bottom w:type="dxa" w:w="60"/>
-              <w:right w:type="dxa" w:w="100"/>
-            </w:tcMar>
-          </w:tcPr>
-          <w:p>
-            <w:pPr>
-              <w:spacing w:after="20" w:line="252"/>
-            </w:pPr>
+            <w:tcW w:type="dxa" w:w="2000"/>
+            <w:tcBorders>
+              <w:top w:val="single" w:color="C9D3E3" w:sz="4"/>
+              <w:left w:val="single" w:color="C9D3E3" w:sz="4"/>
+              <w:bottom w:val="single" w:color="C9D3E3" w:sz="4"/>
+              <w:right w:val="single" w:color="C9D3E3" w:sz="4"/>
+            </w:tcBorders>
+            <w:shd w:fill="E8F1FC" w:color="auto" w:val="clear"/>
+            <w:tcMar>
+              <w:top w:type="dxa" w:w="60"/>
+              <w:left w:type="dxa" w:w="100"/>
+              <w:bottom w:type="dxa" w:w="60"/>
+              <w:right w:type="dxa" w:w="100"/>
+            </w:tcMar>
+          </w:tcPr>
+          <w:p>
+            <w:pPr>
+              <w:spacing w:after="20" w:line="252"/>
+            </w:pPr>
+            <w:r>
+              <w:rPr>
+                <w:rFonts w:ascii="Nunito" w:cs="Nunito" w:eastAsia="Nunito" w:hAnsi="Nunito"/>
+                <w:color w:val="1D2433"/>
+                <w:sz w:val="18"/>
+                <w:szCs w:val="18"/>
+              </w:rPr>
+              <w:t xml:space="preserve">M. VASSEUR, né le 03/11/1963</w:t>
+            </w:r>
           </w:p>
         </w:tc>
         <w:tc>
@@ -4660,7 +7713,53 @@
         </w:tc>
         <w:tc>
           <w:tcPr>
-            <w:tcW w:type="dxa" w:w="2338"/>
+            <w:tcW w:type="dxa" w:w="1700"/>
+            <w:tcBorders>
+              <w:top w:val="single" w:color="C9D3E3" w:sz="4"/>
+              <w:left w:val="single" w:color="C9D3E3" w:sz="4"/>
+              <w:bottom w:val="single" w:color="C9D3E3" w:sz="4"/>
+              <w:right w:val="single" w:color="C9D3E3" w:sz="4"/>
+            </w:tcBorders>
+            <w:shd w:fill="E8F1FC" w:color="auto" w:val="clear"/>
+            <w:tcMar>
+              <w:top w:type="dxa" w:w="60"/>
+              <w:left w:type="dxa" w:w="100"/>
+              <w:bottom w:type="dxa" w:w="60"/>
+              <w:right w:type="dxa" w:w="100"/>
+            </w:tcMar>
+          </w:tcPr>
+          <w:p>
+            <w:pPr>
+              <w:spacing w:after="20" w:line="252"/>
+            </w:pPr>
+          </w:p>
+        </w:tc>
+        <w:tc>
+          <w:tcPr>
+            <w:tcW w:type="dxa" w:w="1900"/>
+            <w:tcBorders>
+              <w:top w:val="single" w:color="C9D3E3" w:sz="4"/>
+              <w:left w:val="single" w:color="C9D3E3" w:sz="4"/>
+              <w:bottom w:val="single" w:color="C9D3E3" w:sz="4"/>
+              <w:right w:val="single" w:color="C9D3E3" w:sz="4"/>
+            </w:tcBorders>
+            <w:shd w:fill="E8F1FC" w:color="auto" w:val="clear"/>
+            <w:tcMar>
+              <w:top w:type="dxa" w:w="60"/>
+              <w:left w:type="dxa" w:w="100"/>
+              <w:bottom w:type="dxa" w:w="60"/>
+              <w:right w:type="dxa" w:w="100"/>
+            </w:tcMar>
+          </w:tcPr>
+          <w:p>
+            <w:pPr>
+              <w:spacing w:after="20" w:line="252"/>
+            </w:pPr>
+          </w:p>
+        </w:tc>
+        <w:tc>
+          <w:tcPr>
+            <w:tcW w:type="dxa" w:w="2138"/>
             <w:tcBorders>
               <w:top w:val="single" w:color="C9D3E3" w:sz="4"/>
               <w:left w:val="single" w:color="C9D3E3" w:sz="4"/>
@@ -4689,7 +7788,7 @@
         </w:trPr>
         <w:tc>
           <w:tcPr>
-            <w:tcW w:type="dxa" w:w="2700"/>
+            <w:tcW w:type="dxa" w:w="2000"/>
             <w:tcBorders>
               <w:top w:val="single" w:color="C9D3E3" w:sz="4"/>
               <w:left w:val="single" w:color="C9D3E3" w:sz="4"/>
@@ -4721,7 +7820,7 @@
         </w:tc>
         <w:tc>
           <w:tcPr>
-            <w:tcW w:type="dxa" w:w="2700"/>
+            <w:tcW w:type="dxa" w:w="1900"/>
             <w:tcBorders>
               <w:top w:val="single" w:color="C9D3E3" w:sz="4"/>
               <w:left w:val="single" w:color="C9D3E3" w:sz="4"/>
@@ -4744,6 +7843,29 @@
         </w:tc>
         <w:tc>
           <w:tcPr>
+            <w:tcW w:type="dxa" w:w="1700"/>
+            <w:tcBorders>
+              <w:top w:val="single" w:color="C9D3E3" w:sz="4"/>
+              <w:left w:val="single" w:color="C9D3E3" w:sz="4"/>
+              <w:bottom w:val="single" w:color="C9D3E3" w:sz="4"/>
+              <w:right w:val="single" w:color="C9D3E3" w:sz="4"/>
+            </w:tcBorders>
+            <w:shd w:fill="FFFFFF" w:color="auto" w:val="clear"/>
+            <w:tcMar>
+              <w:top w:type="dxa" w:w="60"/>
+              <w:left w:type="dxa" w:w="100"/>
+              <w:bottom w:type="dxa" w:w="60"/>
+              <w:right w:type="dxa" w:w="100"/>
+            </w:tcMar>
+          </w:tcPr>
+          <w:p>
+            <w:pPr>
+              <w:spacing w:after="20" w:line="252"/>
+            </w:pPr>
+          </w:p>
+        </w:tc>
+        <w:tc>
+          <w:tcPr>
             <w:tcW w:type="dxa" w:w="1900"/>
             <w:tcBorders>
               <w:top w:val="single" w:color="C9D3E3" w:sz="4"/>
@@ -4767,7 +7889,7 @@
         </w:tc>
         <w:tc>
           <w:tcPr>
-            <w:tcW w:type="dxa" w:w="2338"/>
+            <w:tcW w:type="dxa" w:w="2138"/>
             <w:tcBorders>
               <w:top w:val="single" w:color="C9D3E3" w:sz="4"/>
               <w:left w:val="single" w:color="C9D3E3" w:sz="4"/>
@@ -4796,7 +7918,7 @@
         </w:trPr>
         <w:tc>
           <w:tcPr>
-            <w:tcW w:type="dxa" w:w="2700"/>
+            <w:tcW w:type="dxa" w:w="2000"/>
             <w:tcBorders>
               <w:top w:val="single" w:color="C9D3E3" w:sz="4"/>
               <w:left w:val="single" w:color="C9D3E3" w:sz="4"/>
@@ -4828,29 +7950,6 @@
         </w:tc>
         <w:tc>
           <w:tcPr>
-            <w:tcW w:type="dxa" w:w="2700"/>
-            <w:tcBorders>
-              <w:top w:val="single" w:color="C9D3E3" w:sz="4"/>
-              <w:left w:val="single" w:color="C9D3E3" w:sz="4"/>
-              <w:bottom w:val="single" w:color="C9D3E3" w:sz="4"/>
-              <w:right w:val="single" w:color="C9D3E3" w:sz="4"/>
-            </w:tcBorders>
-            <w:shd w:fill="E8F1FC" w:color="auto" w:val="clear"/>
-            <w:tcMar>
-              <w:top w:type="dxa" w:w="60"/>
-              <w:left w:type="dxa" w:w="100"/>
-              <w:bottom w:type="dxa" w:w="60"/>
-              <w:right w:type="dxa" w:w="100"/>
-            </w:tcMar>
-          </w:tcPr>
-          <w:p>
-            <w:pPr>
-              <w:spacing w:after="20" w:line="252"/>
-            </w:pPr>
-          </w:p>
-        </w:tc>
-        <w:tc>
-          <w:tcPr>
             <w:tcW w:type="dxa" w:w="1900"/>
             <w:tcBorders>
               <w:top w:val="single" w:color="C9D3E3" w:sz="4"/>
@@ -4874,7 +7973,53 @@
         </w:tc>
         <w:tc>
           <w:tcPr>
-            <w:tcW w:type="dxa" w:w="2338"/>
+            <w:tcW w:type="dxa" w:w="1700"/>
+            <w:tcBorders>
+              <w:top w:val="single" w:color="C9D3E3" w:sz="4"/>
+              <w:left w:val="single" w:color="C9D3E3" w:sz="4"/>
+              <w:bottom w:val="single" w:color="C9D3E3" w:sz="4"/>
+              <w:right w:val="single" w:color="C9D3E3" w:sz="4"/>
+            </w:tcBorders>
+            <w:shd w:fill="E8F1FC" w:color="auto" w:val="clear"/>
+            <w:tcMar>
+              <w:top w:type="dxa" w:w="60"/>
+              <w:left w:type="dxa" w:w="100"/>
+              <w:bottom w:type="dxa" w:w="60"/>
+              <w:right w:type="dxa" w:w="100"/>
+            </w:tcMar>
+          </w:tcPr>
+          <w:p>
+            <w:pPr>
+              <w:spacing w:after="20" w:line="252"/>
+            </w:pPr>
+          </w:p>
+        </w:tc>
+        <w:tc>
+          <w:tcPr>
+            <w:tcW w:type="dxa" w:w="1900"/>
+            <w:tcBorders>
+              <w:top w:val="single" w:color="C9D3E3" w:sz="4"/>
+              <w:left w:val="single" w:color="C9D3E3" w:sz="4"/>
+              <w:bottom w:val="single" w:color="C9D3E3" w:sz="4"/>
+              <w:right w:val="single" w:color="C9D3E3" w:sz="4"/>
+            </w:tcBorders>
+            <w:shd w:fill="E8F1FC" w:color="auto" w:val="clear"/>
+            <w:tcMar>
+              <w:top w:type="dxa" w:w="60"/>
+              <w:left w:type="dxa" w:w="100"/>
+              <w:bottom w:type="dxa" w:w="60"/>
+              <w:right w:type="dxa" w:w="100"/>
+            </w:tcMar>
+          </w:tcPr>
+          <w:p>
+            <w:pPr>
+              <w:spacing w:after="20" w:line="252"/>
+            </w:pPr>
+          </w:p>
+        </w:tc>
+        <w:tc>
+          <w:tcPr>
+            <w:tcW w:type="dxa" w:w="2138"/>
             <w:tcBorders>
               <w:top w:val="single" w:color="C9D3E3" w:sz="4"/>
               <w:left w:val="single" w:color="C9D3E3" w:sz="4"/>
@@ -4903,7 +8048,7 @@
         </w:trPr>
         <w:tc>
           <w:tcPr>
-            <w:tcW w:type="dxa" w:w="2700"/>
+            <w:tcW w:type="dxa" w:w="2000"/>
             <w:tcBorders>
               <w:top w:val="single" w:color="C9D3E3" w:sz="4"/>
               <w:left w:val="single" w:color="C9D3E3" w:sz="4"/>
@@ -4935,7 +8080,7 @@
         </w:tc>
         <w:tc>
           <w:tcPr>
-            <w:tcW w:type="dxa" w:w="2700"/>
+            <w:tcW w:type="dxa" w:w="1900"/>
             <w:tcBorders>
               <w:top w:val="single" w:color="C9D3E3" w:sz="4"/>
               <w:left w:val="single" w:color="C9D3E3" w:sz="4"/>
@@ -4958,6 +8103,29 @@
         </w:tc>
         <w:tc>
           <w:tcPr>
+            <w:tcW w:type="dxa" w:w="1700"/>
+            <w:tcBorders>
+              <w:top w:val="single" w:color="C9D3E3" w:sz="4"/>
+              <w:left w:val="single" w:color="C9D3E3" w:sz="4"/>
+              <w:bottom w:val="single" w:color="C9D3E3" w:sz="4"/>
+              <w:right w:val="single" w:color="C9D3E3" w:sz="4"/>
+            </w:tcBorders>
+            <w:shd w:fill="FFFFFF" w:color="auto" w:val="clear"/>
+            <w:tcMar>
+              <w:top w:type="dxa" w:w="60"/>
+              <w:left w:type="dxa" w:w="100"/>
+              <w:bottom w:type="dxa" w:w="60"/>
+              <w:right w:type="dxa" w:w="100"/>
+            </w:tcMar>
+          </w:tcPr>
+          <w:p>
+            <w:pPr>
+              <w:spacing w:after="20" w:line="252"/>
+            </w:pPr>
+          </w:p>
+        </w:tc>
+        <w:tc>
+          <w:tcPr>
             <w:tcW w:type="dxa" w:w="1900"/>
             <w:tcBorders>
               <w:top w:val="single" w:color="C9D3E3" w:sz="4"/>
@@ -4981,7 +8149,7 @@
         </w:tc>
         <w:tc>
           <w:tcPr>
-            <w:tcW w:type="dxa" w:w="2338"/>
+            <w:tcW w:type="dxa" w:w="2138"/>
             <w:tcBorders>
               <w:top w:val="single" w:color="C9D3E3" w:sz="4"/>
               <w:left w:val="single" w:color="C9D3E3" w:sz="4"/>
@@ -5044,7 +8212,7 @@
           <w:sz w:val="20"/>
           <w:szCs w:val="20"/>
         </w:rPr>
-        <w:t xml:space="preserve">Durée : 1 h 40</w:t>
+        <w:t xml:space="preserve">Durée : 1 h 25</w:t>
       </w:r>
       <w:r>
         <w:rPr>
@@ -5053,7 +8221,7 @@
           <w:sz w:val="20"/>
           <w:szCs w:val="20"/>
         </w:rPr>
-        <w:t xml:space="preserve"> · Instruction et calcul en binôme sur la fiche (65 min), exercice interactif n°1 (20 min), correction (15 min) · PDF « Séquence 4 »</w:t>
+        <w:t xml:space="preserve"> · Instruction et calcul en binôme sur la fiche (55 min), exercice interactif n°1 (15 min), correction (15 min) · PDF « Séquence 4 »</w:t>
       </w:r>
     </w:p>
     <w:p>

</xml_diff>